<commit_message>
Short MVP: live auto-refresh on a real-time DW
The DW is updated from Salesforce in real time, so no extra load is
needed. Target is at most 60 seconds from a Salesforce change to the
screen, with automatic refresh (in-database tables plus a refresh
mechanism to confirm with the Spotfire vendor). DBA work drops to views
over open records; freshness KPI and plan updated.

Co-Authored-By: Claude Opus 5.5 <noreply@anthropic.com>
Claude-Session: https://claude.ai/code/session_01YcEMp91cmPuH2YbvGBFx73
</commit_message>
<xml_diff>
--- a/docs/MVP-Short.docx
+++ b/docs/MVP-Short.docx
@@ -455,7 +455,7 @@
           <w:rFonts w:ascii="Arial" w:cs="Arial" w:eastAsia="Arial" w:hAnsi="Arial"/>
           <w:rtl/>
         </w:rPr>
-        <w:t xml:space="preserve"> מסך חי אחד ב-Spotfire Cloud, שמתעדכן כל 5-15 דקות ועונה על שאלה אחת: </w:t>
+        <w:t xml:space="preserve"> מסך חי אחד ב-Spotfire Cloud, שמתרענן לבד כל 30-60 שניות ועונה על שאלה אחת: </w:t>
       </w:r>
       <w:r>
         <w:rPr>
@@ -2566,15 +2566,404 @@
           <w:bCs/>
           <w:rtl/>
         </w:rPr>
-        <w:t xml:space="preserve">דרישת עדכניות:</w:t>
+        <w:t xml:space="preserve">דרישת עדכניות: המסך מתרענן לבד, בלי שמישהו לוחץ "רענן".</w:t>
       </w:r>
+    </w:p>
+    <w:p>
+      <w:pPr>
+        <w:bidi/>
+        <w:spacing w:after="120" w:line="276"/>
+        <w:jc w:val="start"/>
+      </w:pPr>
       <w:r>
         <w:rPr>
           <w:rFonts w:ascii="Arial" w:cs="Arial" w:eastAsia="Arial" w:hAnsi="Arial"/>
           <w:rtl/>
         </w:rPr>
-        <w:t xml:space="preserve"> הנתונים חייבים להתעדכן כל 5-15 דקות. אם ה-DW מתעדכן היום פעם ביום, צריך להוסיף טעינה אינקרמנטלית לארבעת האובייקטים. </w:t>
+        <w:t xml:space="preserve">ה-DW מתעדכן מ-Salesforce בזמן אמת, ולכן אין צורך בטעינה נוספת. מה שקובע עכשיו כמה המסך "חי" הוא Spotfire: כל כמה זמן המסך שולף מחדש את הנתונים מה-DW.</w:t>
       </w:r>
+    </w:p>
+    <w:tbl>
+      <w:tblPr>
+        <w:bidiVisual/>
+        <w:tblW w:type="dxa" w:w="9638"/>
+        <w:tblBorders>
+          <w:top w:val="single" w:color="auto" w:sz="4"/>
+          <w:left w:val="single" w:color="auto" w:sz="4"/>
+          <w:bottom w:val="single" w:color="auto" w:sz="4"/>
+          <w:right w:val="single" w:color="auto" w:sz="4"/>
+          <w:insideH w:val="single" w:color="auto" w:sz="4"/>
+          <w:insideV w:val="single" w:color="auto" w:sz="4"/>
+        </w:tblBorders>
+        <w:tblLayout w:type="fixed"/>
+      </w:tblPr>
+      <w:tblGrid>
+        <w:gridCol w:w="3614"/>
+        <w:gridCol w:w="6024"/>
+      </w:tblGrid>
+      <w:tr>
+        <w:trPr>
+          <w:tblHeader/>
+        </w:trPr>
+        <w:tc>
+          <w:tcPr>
+            <w:tcW w:type="dxa" w:w="3614"/>
+            <w:tcBorders>
+              <w:top w:val="single" w:color="BFBFBF" w:sz="4"/>
+              <w:left w:val="single" w:color="BFBFBF" w:sz="4"/>
+              <w:bottom w:val="single" w:color="BFBFBF" w:sz="4"/>
+              <w:right w:val="single" w:color="BFBFBF" w:sz="4"/>
+            </w:tcBorders>
+            <w:shd w:fill="DCE6F1" w:color="auto" w:val="clear"/>
+            <w:tcMar>
+              <w:top w:type="dxa" w:w="60"/>
+              <w:left w:type="dxa" w:w="100"/>
+              <w:bottom w:type="dxa" w:w="60"/>
+              <w:right w:type="dxa" w:w="100"/>
+            </w:tcMar>
+          </w:tcPr>
+          <w:p>
+            <w:pPr>
+              <w:bidi/>
+              <w:spacing w:after="0"/>
+            </w:pPr>
+            <w:r>
+              <w:rPr>
+                <w:rFonts w:ascii="Arial" w:cs="Arial" w:eastAsia="Arial" w:hAnsi="Arial"/>
+                <w:b/>
+                <w:bCs/>
+                <w:sz w:val="19"/>
+                <w:szCs w:val="19"/>
+                <w:rtl/>
+              </w:rPr>
+              <w:t xml:space="preserve">דרישה</w:t>
+            </w:r>
+          </w:p>
+        </w:tc>
+        <w:tc>
+          <w:tcPr>
+            <w:tcW w:type="dxa" w:w="6024"/>
+            <w:tcBorders>
+              <w:top w:val="single" w:color="BFBFBF" w:sz="4"/>
+              <w:left w:val="single" w:color="BFBFBF" w:sz="4"/>
+              <w:bottom w:val="single" w:color="BFBFBF" w:sz="4"/>
+              <w:right w:val="single" w:color="BFBFBF" w:sz="4"/>
+            </w:tcBorders>
+            <w:shd w:fill="DCE6F1" w:color="auto" w:val="clear"/>
+            <w:tcMar>
+              <w:top w:type="dxa" w:w="60"/>
+              <w:left w:type="dxa" w:w="100"/>
+              <w:bottom w:type="dxa" w:w="60"/>
+              <w:right w:type="dxa" w:w="100"/>
+            </w:tcMar>
+          </w:tcPr>
+          <w:p>
+            <w:pPr>
+              <w:bidi/>
+              <w:spacing w:after="0"/>
+            </w:pPr>
+            <w:r>
+              <w:rPr>
+                <w:rFonts w:ascii="Arial" w:cs="Arial" w:eastAsia="Arial" w:hAnsi="Arial"/>
+                <w:b/>
+                <w:bCs/>
+                <w:sz w:val="19"/>
+                <w:szCs w:val="19"/>
+                <w:rtl/>
+              </w:rPr>
+              <w:t xml:space="preserve">יעד</w:t>
+            </w:r>
+          </w:p>
+        </w:tc>
+      </w:tr>
+      <w:tr>
+        <w:trPr>
+          <w:tblHeader w:val="false"/>
+        </w:trPr>
+        <w:tc>
+          <w:tcPr>
+            <w:tcW w:type="dxa" w:w="3614"/>
+            <w:tcBorders>
+              <w:top w:val="single" w:color="BFBFBF" w:sz="4"/>
+              <w:left w:val="single" w:color="BFBFBF" w:sz="4"/>
+              <w:bottom w:val="single" w:color="BFBFBF" w:sz="4"/>
+              <w:right w:val="single" w:color="BFBFBF" w:sz="4"/>
+            </w:tcBorders>
+            <w:tcMar>
+              <w:top w:type="dxa" w:w="60"/>
+              <w:left w:type="dxa" w:w="100"/>
+              <w:bottom w:type="dxa" w:w="60"/>
+              <w:right w:type="dxa" w:w="100"/>
+            </w:tcMar>
+          </w:tcPr>
+          <w:p>
+            <w:pPr>
+              <w:bidi/>
+              <w:spacing w:after="0"/>
+            </w:pPr>
+            <w:r>
+              <w:rPr>
+                <w:rFonts w:ascii="Arial" w:cs="Arial" w:eastAsia="Arial" w:hAnsi="Arial"/>
+                <w:sz w:val="19"/>
+                <w:szCs w:val="19"/>
+                <w:rtl/>
+              </w:rPr>
+              <w:t xml:space="preserve">פער בין שינוי ב-Salesforce לבין המסך</w:t>
+            </w:r>
+          </w:p>
+        </w:tc>
+        <w:tc>
+          <w:tcPr>
+            <w:tcW w:type="dxa" w:w="6024"/>
+            <w:tcBorders>
+              <w:top w:val="single" w:color="BFBFBF" w:sz="4"/>
+              <w:left w:val="single" w:color="BFBFBF" w:sz="4"/>
+              <w:bottom w:val="single" w:color="BFBFBF" w:sz="4"/>
+              <w:right w:val="single" w:color="BFBFBF" w:sz="4"/>
+            </w:tcBorders>
+            <w:tcMar>
+              <w:top w:type="dxa" w:w="60"/>
+              <w:left w:type="dxa" w:w="100"/>
+              <w:bottom w:type="dxa" w:w="60"/>
+              <w:right w:type="dxa" w:w="100"/>
+            </w:tcMar>
+          </w:tcPr>
+          <w:p>
+            <w:pPr>
+              <w:bidi/>
+              <w:spacing w:after="0"/>
+            </w:pPr>
+            <w:r>
+              <w:rPr>
+                <w:rFonts w:ascii="Arial" w:cs="Arial" w:eastAsia="Arial" w:hAnsi="Arial"/>
+                <w:sz w:val="19"/>
+                <w:szCs w:val="19"/>
+                <w:rtl/>
+              </w:rPr>
+              <w:t xml:space="preserve">עד 60 שניות (יעד: 30 שניות)</w:t>
+            </w:r>
+          </w:p>
+        </w:tc>
+      </w:tr>
+      <w:tr>
+        <w:trPr>
+          <w:tblHeader w:val="false"/>
+        </w:trPr>
+        <w:tc>
+          <w:tcPr>
+            <w:tcW w:type="dxa" w:w="3614"/>
+            <w:tcBorders>
+              <w:top w:val="single" w:color="BFBFBF" w:sz="4"/>
+              <w:left w:val="single" w:color="BFBFBF" w:sz="4"/>
+              <w:bottom w:val="single" w:color="BFBFBF" w:sz="4"/>
+              <w:right w:val="single" w:color="BFBFBF" w:sz="4"/>
+            </w:tcBorders>
+            <w:tcMar>
+              <w:top w:type="dxa" w:w="60"/>
+              <w:left w:type="dxa" w:w="100"/>
+              <w:bottom w:type="dxa" w:w="60"/>
+              <w:right w:type="dxa" w:w="100"/>
+            </w:tcMar>
+          </w:tcPr>
+          <w:p>
+            <w:pPr>
+              <w:bidi/>
+              <w:spacing w:after="0"/>
+            </w:pPr>
+            <w:r>
+              <w:rPr>
+                <w:rFonts w:ascii="Arial" w:cs="Arial" w:eastAsia="Arial" w:hAnsi="Arial"/>
+                <w:sz w:val="19"/>
+                <w:szCs w:val="19"/>
+                <w:rtl/>
+              </w:rPr>
+              <w:t xml:space="preserve">רענון המסך</w:t>
+            </w:r>
+          </w:p>
+        </w:tc>
+        <w:tc>
+          <w:tcPr>
+            <w:tcW w:type="dxa" w:w="6024"/>
+            <w:tcBorders>
+              <w:top w:val="single" w:color="BFBFBF" w:sz="4"/>
+              <w:left w:val="single" w:color="BFBFBF" w:sz="4"/>
+              <w:bottom w:val="single" w:color="BFBFBF" w:sz="4"/>
+              <w:right w:val="single" w:color="BFBFBF" w:sz="4"/>
+            </w:tcBorders>
+            <w:tcMar>
+              <w:top w:type="dxa" w:w="60"/>
+              <w:left w:type="dxa" w:w="100"/>
+              <w:bottom w:type="dxa" w:w="60"/>
+              <w:right w:type="dxa" w:w="100"/>
+            </w:tcMar>
+          </w:tcPr>
+          <w:p>
+            <w:pPr>
+              <w:bidi/>
+              <w:spacing w:after="0"/>
+            </w:pPr>
+            <w:r>
+              <w:rPr>
+                <w:rFonts w:ascii="Arial" w:cs="Arial" w:eastAsia="Arial" w:hAnsi="Arial"/>
+                <w:sz w:val="19"/>
+                <w:szCs w:val="19"/>
+                <w:rtl/>
+              </w:rPr>
+              <w:t xml:space="preserve">אוטומטי, בלי פעולה של המשתמש, כולל במסך הקיר</w:t>
+            </w:r>
+          </w:p>
+        </w:tc>
+      </w:tr>
+      <w:tr>
+        <w:trPr>
+          <w:tblHeader w:val="false"/>
+        </w:trPr>
+        <w:tc>
+          <w:tcPr>
+            <w:tcW w:type="dxa" w:w="3614"/>
+            <w:tcBorders>
+              <w:top w:val="single" w:color="BFBFBF" w:sz="4"/>
+              <w:left w:val="single" w:color="BFBFBF" w:sz="4"/>
+              <w:bottom w:val="single" w:color="BFBFBF" w:sz="4"/>
+              <w:right w:val="single" w:color="BFBFBF" w:sz="4"/>
+            </w:tcBorders>
+            <w:tcMar>
+              <w:top w:type="dxa" w:w="60"/>
+              <w:left w:type="dxa" w:w="100"/>
+              <w:bottom w:type="dxa" w:w="60"/>
+              <w:right w:type="dxa" w:w="100"/>
+            </w:tcMar>
+          </w:tcPr>
+          <w:p>
+            <w:pPr>
+              <w:bidi/>
+              <w:spacing w:after="0"/>
+            </w:pPr>
+            <w:r>
+              <w:rPr>
+                <w:rFonts w:ascii="Arial" w:cs="Arial" w:eastAsia="Arial" w:hAnsi="Arial"/>
+                <w:sz w:val="19"/>
+                <w:szCs w:val="19"/>
+                <w:rtl/>
+              </w:rPr>
+              <w:t xml:space="preserve">שעון "הזמן שנשאר" ב-SLA בסיכון</w:t>
+            </w:r>
+          </w:p>
+        </w:tc>
+        <w:tc>
+          <w:tcPr>
+            <w:tcW w:type="dxa" w:w="6024"/>
+            <w:tcBorders>
+              <w:top w:val="single" w:color="BFBFBF" w:sz="4"/>
+              <w:left w:val="single" w:color="BFBFBF" w:sz="4"/>
+              <w:bottom w:val="single" w:color="BFBFBF" w:sz="4"/>
+              <w:right w:val="single" w:color="BFBFBF" w:sz="4"/>
+            </w:tcBorders>
+            <w:tcMar>
+              <w:top w:type="dxa" w:w="60"/>
+              <w:left w:type="dxa" w:w="100"/>
+              <w:bottom w:type="dxa" w:w="60"/>
+              <w:right w:type="dxa" w:w="100"/>
+            </w:tcMar>
+          </w:tcPr>
+          <w:p>
+            <w:pPr>
+              <w:bidi/>
+              <w:spacing w:after="0"/>
+            </w:pPr>
+            <w:r>
+              <w:rPr>
+                <w:rFonts w:ascii="Arial" w:cs="Arial" w:eastAsia="Arial" w:hAnsi="Arial"/>
+                <w:sz w:val="19"/>
+                <w:szCs w:val="19"/>
+                <w:rtl/>
+              </w:rPr>
+              <w:t xml:space="preserve">מחושב מחדש בכל רענון</w:t>
+            </w:r>
+          </w:p>
+        </w:tc>
+      </w:tr>
+      <w:tr>
+        <w:trPr>
+          <w:tblHeader w:val="false"/>
+        </w:trPr>
+        <w:tc>
+          <w:tcPr>
+            <w:tcW w:type="dxa" w:w="3614"/>
+            <w:tcBorders>
+              <w:top w:val="single" w:color="BFBFBF" w:sz="4"/>
+              <w:left w:val="single" w:color="BFBFBF" w:sz="4"/>
+              <w:bottom w:val="single" w:color="BFBFBF" w:sz="4"/>
+              <w:right w:val="single" w:color="BFBFBF" w:sz="4"/>
+            </w:tcBorders>
+            <w:tcMar>
+              <w:top w:type="dxa" w:w="60"/>
+              <w:left w:type="dxa" w:w="100"/>
+              <w:bottom w:type="dxa" w:w="60"/>
+              <w:right w:type="dxa" w:w="100"/>
+            </w:tcMar>
+          </w:tcPr>
+          <w:p>
+            <w:pPr>
+              <w:bidi/>
+              <w:spacing w:after="0"/>
+            </w:pPr>
+            <w:r>
+              <w:rPr>
+                <w:rFonts w:ascii="Arial" w:cs="Arial" w:eastAsia="Arial" w:hAnsi="Arial"/>
+                <w:sz w:val="19"/>
+                <w:szCs w:val="19"/>
+                <w:rtl/>
+              </w:rPr>
+              <w:t xml:space="preserve">חותמת "עודכן לאחרונה"</w:t>
+            </w:r>
+          </w:p>
+        </w:tc>
+        <w:tc>
+          <w:tcPr>
+            <w:tcW w:type="dxa" w:w="6024"/>
+            <w:tcBorders>
+              <w:top w:val="single" w:color="BFBFBF" w:sz="4"/>
+              <w:left w:val="single" w:color="BFBFBF" w:sz="4"/>
+              <w:bottom w:val="single" w:color="BFBFBF" w:sz="4"/>
+              <w:right w:val="single" w:color="BFBFBF" w:sz="4"/>
+            </w:tcBorders>
+            <w:tcMar>
+              <w:top w:type="dxa" w:w="60"/>
+              <w:left w:type="dxa" w:w="100"/>
+              <w:bottom w:type="dxa" w:w="60"/>
+              <w:right w:type="dxa" w:w="100"/>
+            </w:tcMar>
+          </w:tcPr>
+          <w:p>
+            <w:pPr>
+              <w:bidi/>
+              <w:spacing w:after="0"/>
+            </w:pPr>
+            <w:r>
+              <w:rPr>
+                <w:rFonts w:ascii="Arial" w:cs="Arial" w:eastAsia="Arial" w:hAnsi="Arial"/>
+                <w:sz w:val="19"/>
+                <w:szCs w:val="19"/>
+                <w:rtl/>
+              </w:rPr>
+              <w:t xml:space="preserve">מתעדכנת בכל רענון. אם הנתונים בני יותר מ-5 דקות, מוצגת אזהרה בולטת</w:t>
+            </w:r>
+          </w:p>
+        </w:tc>
+      </w:tr>
+    </w:tbl>
+    <w:p>
+      <w:pPr>
+        <w:spacing w:after="120"/>
+      </w:pPr>
+    </w:p>
+    <w:p>
+      <w:pPr>
+        <w:bidi/>
+        <w:spacing w:after="120" w:line="276"/>
+        <w:jc w:val="start"/>
+      </w:pPr>
       <w:r>
         <w:rPr>
           <w:rFonts w:ascii="Arial" w:cs="Arial" w:eastAsia="Arial" w:hAnsi="Arial"/>
@@ -2582,14 +2971,123 @@
           <w:bCs/>
           <w:rtl/>
         </w:rPr>
-        <w:t xml:space="preserve">זו העבודה העיקרית ב-MVP</w:t>
+        <w:t xml:space="preserve">איך זה נבנה ב-Spotfire (לאימות מול הספק בשבוע 1):</w:t>
+      </w:r>
+    </w:p>
+    <w:p>
+      <w:pPr>
+        <w:pStyle w:val="ListParagraph"/>
+        <w:numPr>
+          <w:ilvl w:val="0"/>
+          <w:numId w:val="2"/>
+        </w:numPr>
+        <w:bidi/>
+        <w:spacing w:after="60"/>
+        <w:jc w:val="start"/>
+      </w:pPr>
+      <w:r>
+        <w:rPr>
+          <w:rFonts w:ascii="Arial" w:cs="Arial" w:eastAsia="Arial" w:hAnsi="Arial"/>
+          <w:b/>
+          <w:bCs/>
+          <w:rtl/>
+        </w:rPr>
+        <w:t xml:space="preserve">טבלאות in-database (שאילתה חיה מול ה-DW) ולא נתונים מיובאים.</w:t>
       </w:r>
       <w:r>
         <w:rPr>
           <w:rFonts w:ascii="Arial" w:cs="Arial" w:eastAsia="Arial" w:hAnsi="Arial"/>
           <w:rtl/>
         </w:rPr>
-        <w:t xml:space="preserve">, ומסך "חי" שמתעדכן פעם ביום לא שווה כלום.</w:t>
+        <w:t xml:space="preserve"> נתונים מיובאים מתעדכנים רק ברענון מתוזמן, שנמדד בדקות.</w:t>
+      </w:r>
+    </w:p>
+    <w:p>
+      <w:pPr>
+        <w:pStyle w:val="ListParagraph"/>
+        <w:numPr>
+          <w:ilvl w:val="0"/>
+          <w:numId w:val="2"/>
+        </w:numPr>
+        <w:bidi/>
+        <w:spacing w:after="60"/>
+        <w:jc w:val="start"/>
+      </w:pPr>
+      <w:r>
+        <w:rPr>
+          <w:rFonts w:ascii="Arial" w:cs="Arial" w:eastAsia="Arial" w:hAnsi="Arial"/>
+          <w:b/>
+          <w:bCs/>
+          <w:rtl/>
+        </w:rPr>
+        <w:t xml:space="preserve">מנגנון הרענון האוטומטי:</w:t>
+      </w:r>
+      <w:r>
+        <w:rPr>
+          <w:rFonts w:ascii="Arial" w:cs="Arial" w:eastAsia="Arial" w:hAnsi="Arial"/>
+          <w:rtl/>
+        </w:rPr>
+        <w:t xml:space="preserve"> צריך לברר מול הספק מה גרסת Spotfire Cloud שלכם תומכת בו. לא מצאתי תיעוד רשמי לרענון אוטומטי ברמת שניות. הפתרון המקובל בקהילה הוא סקריפט קטן בתוך הניתוח שמרענן את הטבלאות כל X שניות, והיועץ יבנה אותו אם אין אפשרות מובנית.</w:t>
+      </w:r>
+    </w:p>
+    <w:p>
+      <w:pPr>
+        <w:pStyle w:val="ListParagraph"/>
+        <w:numPr>
+          <w:ilvl w:val="0"/>
+          <w:numId w:val="2"/>
+        </w:numPr>
+        <w:bidi/>
+        <w:spacing w:after="60"/>
+        <w:jc w:val="start"/>
+      </w:pPr>
+      <w:r>
+        <w:rPr>
+          <w:rFonts w:ascii="Arial" w:cs="Arial" w:eastAsia="Arial" w:hAnsi="Arial"/>
+          <w:b/>
+          <w:bCs/>
+          <w:rtl/>
+        </w:rPr>
+        <w:t xml:space="preserve">ה-views ב-DW מחזירים רק רשומות פתוחות:</w:t>
+      </w:r>
+      <w:r>
+        <w:rPr>
+          <w:rFonts w:ascii="Arial" w:cs="Arial" w:eastAsia="Arial" w:hAnsi="Arial"/>
+          <w:rtl/>
+        </w:rPr>
+        <w:t xml:space="preserve"> כמה מאות שורות. כך שאילתה כל 30 שניות, מ-8 משתמשים ומסך אחד, לא מעמיסה על ה-DW.</w:t>
+      </w:r>
+    </w:p>
+    <w:p>
+      <w:pPr>
+        <w:pBdr>
+          <w:right w:val="single" w:color="E69500" w:sz="18" w:space="6"/>
+        </w:pBdr>
+        <w:shd w:fill="FFF4E5" w:color="auto" w:val="clear"/>
+        <w:bidi/>
+        <w:spacing w:after="120" w:line="276"/>
+        <w:ind w:start="200"/>
+        <w:jc w:val="start"/>
+      </w:pPr>
+      <w:r>
+        <w:rPr>
+          <w:rFonts w:ascii="Arial" w:cs="Arial" w:eastAsia="Arial" w:hAnsi="Arial"/>
+          <w:b/>
+          <w:bCs/>
+          <w:sz w:val="20"/>
+          <w:szCs w:val="20"/>
+          <w:rtl/>
+        </w:rPr>
+        <w:t xml:space="preserve">מה צריך לבדוק:</w:t>
+      </w:r>
+      <w:r>
+        <w:rPr>
+          <w:rFonts w:ascii="Arial" w:cs="Arial" w:eastAsia="Arial" w:hAnsi="Arial"/>
+          <w:sz w:val="20"/>
+          <w:szCs w:val="20"/>
+          <w:rtl/>
+        </w:rPr>
+        <w:t xml:space="preserve"> "Real time" ב-DW יכול להיות שנייה אחת או חמש דקות. צריך לבדוק מול ה-DBA מה הפער בפועל בין שינוי ב-Salesforce לבין ה-DW, כי זה החסם התחתון לכל מה שהמסך יכול להראות.</w:t>
       </w:r>
     </w:p>
     <w:p>
@@ -3382,9 +3880,9 @@
         <w:tblLayout w:type="fixed"/>
       </w:tblPr>
       <w:tblGrid>
-        <w:gridCol w:w="1389"/>
-        <w:gridCol w:w="5210"/>
-        <w:gridCol w:w="3039"/>
+        <w:gridCol w:w="1133"/>
+        <w:gridCol w:w="4253"/>
+        <w:gridCol w:w="4252"/>
       </w:tblGrid>
       <w:tr>
         <w:trPr>
@@ -3392,7 +3890,7 @@
         </w:trPr>
         <w:tc>
           <w:tcPr>
-            <w:tcW w:type="dxa" w:w="1389"/>
+            <w:tcW w:type="dxa" w:w="1133"/>
             <w:tcBorders>
               <w:top w:val="single" w:color="BFBFBF" w:sz="4"/>
               <w:left w:val="single" w:color="BFBFBF" w:sz="4"/>
@@ -3427,7 +3925,7 @@
         </w:tc>
         <w:tc>
           <w:tcPr>
-            <w:tcW w:type="dxa" w:w="5210"/>
+            <w:tcW w:type="dxa" w:w="4253"/>
             <w:tcBorders>
               <w:top w:val="single" w:color="BFBFBF" w:sz="4"/>
               <w:left w:val="single" w:color="BFBFBF" w:sz="4"/>
@@ -3462,7 +3960,7 @@
         </w:tc>
         <w:tc>
           <w:tcPr>
-            <w:tcW w:type="dxa" w:w="3039"/>
+            <w:tcW w:type="dxa" w:w="4252"/>
             <w:tcBorders>
               <w:top w:val="single" w:color="BFBFBF" w:sz="4"/>
               <w:left w:val="single" w:color="BFBFBF" w:sz="4"/>
@@ -3502,7 +4000,7 @@
         </w:trPr>
         <w:tc>
           <w:tcPr>
-            <w:tcW w:type="dxa" w:w="1389"/>
+            <w:tcW w:type="dxa" w:w="1133"/>
             <w:tcBorders>
               <w:top w:val="single" w:color="BFBFBF" w:sz="4"/>
               <w:left w:val="single" w:color="BFBFBF" w:sz="4"/>
@@ -3536,7 +4034,7 @@
         </w:tc>
         <w:tc>
           <w:tcPr>
-            <w:tcW w:type="dxa" w:w="5210"/>
+            <w:tcW w:type="dxa" w:w="4253"/>
             <w:tcBorders>
               <w:top w:val="single" w:color="BFBFBF" w:sz="4"/>
               <w:left w:val="single" w:color="BFBFBF" w:sz="4"/>
@@ -3568,7 +4066,7 @@
         </w:tc>
         <w:tc>
           <w:tcPr>
-            <w:tcW w:type="dxa" w:w="3039"/>
+            <w:tcW w:type="dxa" w:w="4252"/>
             <w:tcBorders>
               <w:top w:val="single" w:color="BFBFBF" w:sz="4"/>
               <w:left w:val="single" w:color="BFBFBF" w:sz="4"/>
@@ -3605,7 +4103,7 @@
         </w:trPr>
         <w:tc>
           <w:tcPr>
-            <w:tcW w:type="dxa" w:w="1389"/>
+            <w:tcW w:type="dxa" w:w="1133"/>
             <w:tcBorders>
               <w:top w:val="single" w:color="BFBFBF" w:sz="4"/>
               <w:left w:val="single" w:color="BFBFBF" w:sz="4"/>
@@ -3639,65 +4137,65 @@
         </w:tc>
         <w:tc>
           <w:tcPr>
-            <w:tcW w:type="dxa" w:w="5210"/>
-            <w:tcBorders>
-              <w:top w:val="single" w:color="BFBFBF" w:sz="4"/>
-              <w:left w:val="single" w:color="BFBFBF" w:sz="4"/>
-              <w:bottom w:val="single" w:color="BFBFBF" w:sz="4"/>
-              <w:right w:val="single" w:color="BFBFBF" w:sz="4"/>
-            </w:tcBorders>
-            <w:tcMar>
-              <w:top w:type="dxa" w:w="60"/>
-              <w:left w:type="dxa" w:w="100"/>
-              <w:bottom w:type="dxa" w:w="60"/>
-              <w:right w:type="dxa" w:w="100"/>
-            </w:tcMar>
-          </w:tcPr>
-          <w:p>
-            <w:pPr>
-              <w:bidi/>
-              <w:spacing w:after="0"/>
-            </w:pPr>
-            <w:r>
-              <w:rPr>
-                <w:rFonts w:ascii="Arial" w:cs="Arial" w:eastAsia="Arial" w:hAnsi="Arial"/>
-                <w:sz w:val="19"/>
-                <w:szCs w:val="19"/>
-                <w:rtl/>
-              </w:rPr>
-              <w:t xml:space="preserve">הנתונים בני פחות מ-15 דקות ב-95% מהזמן</w:t>
-            </w:r>
-          </w:p>
-        </w:tc>
-        <w:tc>
-          <w:tcPr>
-            <w:tcW w:type="dxa" w:w="3039"/>
-            <w:tcBorders>
-              <w:top w:val="single" w:color="BFBFBF" w:sz="4"/>
-              <w:left w:val="single" w:color="BFBFBF" w:sz="4"/>
-              <w:bottom w:val="single" w:color="BFBFBF" w:sz="4"/>
-              <w:right w:val="single" w:color="BFBFBF" w:sz="4"/>
-            </w:tcBorders>
-            <w:tcMar>
-              <w:top w:type="dxa" w:w="60"/>
-              <w:left w:type="dxa" w:w="100"/>
-              <w:bottom w:type="dxa" w:w="60"/>
-              <w:right w:type="dxa" w:w="100"/>
-            </w:tcMar>
-          </w:tcPr>
-          <w:p>
-            <w:pPr>
-              <w:bidi/>
-              <w:spacing w:after="0"/>
-            </w:pPr>
-            <w:r>
-              <w:rPr>
-                <w:rFonts w:ascii="Arial" w:cs="Arial" w:eastAsia="Arial" w:hAnsi="Arial"/>
-                <w:sz w:val="19"/>
-                <w:szCs w:val="19"/>
-                <w:rtl/>
-              </w:rPr>
-              <w:t xml:space="preserve">חותמת "עודכן לאחרונה" וניטור הטעינה</w:t>
+            <w:tcW w:type="dxa" w:w="4253"/>
+            <w:tcBorders>
+              <w:top w:val="single" w:color="BFBFBF" w:sz="4"/>
+              <w:left w:val="single" w:color="BFBFBF" w:sz="4"/>
+              <w:bottom w:val="single" w:color="BFBFBF" w:sz="4"/>
+              <w:right w:val="single" w:color="BFBFBF" w:sz="4"/>
+            </w:tcBorders>
+            <w:tcMar>
+              <w:top w:type="dxa" w:w="60"/>
+              <w:left w:type="dxa" w:w="100"/>
+              <w:bottom w:type="dxa" w:w="60"/>
+              <w:right w:type="dxa" w:w="100"/>
+            </w:tcMar>
+          </w:tcPr>
+          <w:p>
+            <w:pPr>
+              <w:bidi/>
+              <w:spacing w:after="0"/>
+            </w:pPr>
+            <w:r>
+              <w:rPr>
+                <w:rFonts w:ascii="Arial" w:cs="Arial" w:eastAsia="Arial" w:hAnsi="Arial"/>
+                <w:sz w:val="19"/>
+                <w:szCs w:val="19"/>
+                <w:rtl/>
+              </w:rPr>
+              <w:t xml:space="preserve">פער של עד 60 שניות מ-Salesforce ב-95% מהזמן, ורענון אוטומטי בלי פעולה של המשתמש</w:t>
+            </w:r>
+          </w:p>
+        </w:tc>
+        <w:tc>
+          <w:tcPr>
+            <w:tcW w:type="dxa" w:w="4252"/>
+            <w:tcBorders>
+              <w:top w:val="single" w:color="BFBFBF" w:sz="4"/>
+              <w:left w:val="single" w:color="BFBFBF" w:sz="4"/>
+              <w:bottom w:val="single" w:color="BFBFBF" w:sz="4"/>
+              <w:right w:val="single" w:color="BFBFBF" w:sz="4"/>
+            </w:tcBorders>
+            <w:tcMar>
+              <w:top w:type="dxa" w:w="60"/>
+              <w:left w:type="dxa" w:w="100"/>
+              <w:bottom w:type="dxa" w:w="60"/>
+              <w:right w:type="dxa" w:w="100"/>
+            </w:tcMar>
+          </w:tcPr>
+          <w:p>
+            <w:pPr>
+              <w:bidi/>
+              <w:spacing w:after="0"/>
+            </w:pPr>
+            <w:r>
+              <w:rPr>
+                <w:rFonts w:ascii="Arial" w:cs="Arial" w:eastAsia="Arial" w:hAnsi="Arial"/>
+                <w:sz w:val="19"/>
+                <w:szCs w:val="19"/>
+                <w:rtl/>
+              </w:rPr>
+              <w:t xml:space="preserve">בדיקה יזומה: שינוי Priority של קייס בדיקה ב-Salesforce, ומדידת הזמן עד שהוא מופיע במסך. ובנוסף, חותמת "עודכן לאחרונה"</w:t>
             </w:r>
           </w:p>
         </w:tc>
@@ -3708,7 +4206,7 @@
         </w:trPr>
         <w:tc>
           <w:tcPr>
-            <w:tcW w:type="dxa" w:w="1389"/>
+            <w:tcW w:type="dxa" w:w="1133"/>
             <w:tcBorders>
               <w:top w:val="single" w:color="BFBFBF" w:sz="4"/>
               <w:left w:val="single" w:color="BFBFBF" w:sz="4"/>
@@ -3742,7 +4240,7 @@
         </w:tc>
         <w:tc>
           <w:tcPr>
-            <w:tcW w:type="dxa" w:w="5210"/>
+            <w:tcW w:type="dxa" w:w="4253"/>
             <w:tcBorders>
               <w:top w:val="single" w:color="BFBFBF" w:sz="4"/>
               <w:left w:val="single" w:color="BFBFBF" w:sz="4"/>
@@ -3774,7 +4272,7 @@
         </w:tc>
         <w:tc>
           <w:tcPr>
-            <w:tcW w:type="dxa" w:w="3039"/>
+            <w:tcW w:type="dxa" w:w="4252"/>
             <w:tcBorders>
               <w:top w:val="single" w:color="BFBFBF" w:sz="4"/>
               <w:left w:val="single" w:color="BFBFBF" w:sz="4"/>
@@ -3811,7 +4309,7 @@
         </w:trPr>
         <w:tc>
           <w:tcPr>
-            <w:tcW w:type="dxa" w:w="1389"/>
+            <w:tcW w:type="dxa" w:w="1133"/>
             <w:tcBorders>
               <w:top w:val="single" w:color="BFBFBF" w:sz="4"/>
               <w:left w:val="single" w:color="BFBFBF" w:sz="4"/>
@@ -3845,7 +4343,7 @@
         </w:tc>
         <w:tc>
           <w:tcPr>
-            <w:tcW w:type="dxa" w:w="5210"/>
+            <w:tcW w:type="dxa" w:w="4253"/>
             <w:tcBorders>
               <w:top w:val="single" w:color="BFBFBF" w:sz="4"/>
               <w:left w:val="single" w:color="BFBFBF" w:sz="4"/>
@@ -3877,7 +4375,7 @@
         </w:tc>
         <w:tc>
           <w:tcPr>
-            <w:tcW w:type="dxa" w:w="3039"/>
+            <w:tcW w:type="dxa" w:w="4252"/>
             <w:tcBorders>
               <w:top w:val="single" w:color="BFBFBF" w:sz="4"/>
               <w:left w:val="single" w:color="BFBFBF" w:sz="4"/>
@@ -3914,7 +4412,7 @@
         </w:trPr>
         <w:tc>
           <w:tcPr>
-            <w:tcW w:type="dxa" w:w="1389"/>
+            <w:tcW w:type="dxa" w:w="1133"/>
             <w:tcBorders>
               <w:top w:val="single" w:color="BFBFBF" w:sz="4"/>
               <w:left w:val="single" w:color="BFBFBF" w:sz="4"/>
@@ -3948,7 +4446,7 @@
         </w:tc>
         <w:tc>
           <w:tcPr>
-            <w:tcW w:type="dxa" w:w="5210"/>
+            <w:tcW w:type="dxa" w:w="4253"/>
             <w:tcBorders>
               <w:top w:val="single" w:color="BFBFBF" w:sz="4"/>
               <w:left w:val="single" w:color="BFBFBF" w:sz="4"/>
@@ -3980,7 +4478,7 @@
         </w:tc>
         <w:tc>
           <w:tcPr>
-            <w:tcW w:type="dxa" w:w="3039"/>
+            <w:tcW w:type="dxa" w:w="4252"/>
             <w:tcBorders>
               <w:top w:val="single" w:color="BFBFBF" w:sz="4"/>
               <w:left w:val="single" w:color="BFBFBF" w:sz="4"/>
@@ -4134,8 +4632,8 @@
       </w:tblPr>
       <w:tblGrid>
         <w:gridCol w:w="950"/>
-        <w:gridCol w:w="5444"/>
-        <w:gridCol w:w="3244"/>
+        <w:gridCol w:w="5708"/>
+        <w:gridCol w:w="2980"/>
       </w:tblGrid>
       <w:tr>
         <w:trPr>
@@ -4178,7 +4676,7 @@
         </w:tc>
         <w:tc>
           <w:tcPr>
-            <w:tcW w:type="dxa" w:w="5444"/>
+            <w:tcW w:type="dxa" w:w="5708"/>
             <w:tcBorders>
               <w:top w:val="single" w:color="BFBFBF" w:sz="4"/>
               <w:left w:val="single" w:color="BFBFBF" w:sz="4"/>
@@ -4213,7 +4711,7 @@
         </w:tc>
         <w:tc>
           <w:tcPr>
-            <w:tcW w:type="dxa" w:w="3244"/>
+            <w:tcW w:type="dxa" w:w="2980"/>
             <w:tcBorders>
               <w:top w:val="single" w:color="BFBFBF" w:sz="4"/>
               <w:left w:val="single" w:color="BFBFBF" w:sz="4"/>
@@ -4287,65 +4785,65 @@
         </w:tc>
         <w:tc>
           <w:tcPr>
-            <w:tcW w:type="dxa" w:w="5444"/>
-            <w:tcBorders>
-              <w:top w:val="single" w:color="BFBFBF" w:sz="4"/>
-              <w:left w:val="single" w:color="BFBFBF" w:sz="4"/>
-              <w:bottom w:val="single" w:color="BFBFBF" w:sz="4"/>
-              <w:right w:val="single" w:color="BFBFBF" w:sz="4"/>
-            </w:tcBorders>
-            <w:tcMar>
-              <w:top w:type="dxa" w:w="60"/>
-              <w:left w:type="dxa" w:w="100"/>
-              <w:bottom w:type="dxa" w:w="60"/>
-              <w:right w:type="dxa" w:w="100"/>
-            </w:tcMar>
-          </w:tcPr>
-          <w:p>
-            <w:pPr>
-              <w:bidi/>
-              <w:spacing w:after="0"/>
-            </w:pPr>
-            <w:r>
-              <w:rPr>
-                <w:rFonts w:ascii="Arial" w:cs="Arial" w:eastAsia="Arial" w:hAnsi="Arial"/>
-                <w:sz w:val="19"/>
-                <w:szCs w:val="19"/>
-                <w:rtl/>
-              </w:rPr>
-              <w:t xml:space="preserve">בדיקה מה כבר קיים ב-DW ובאיזו תדירות; גישה לקריאה מ-Salesforce; תיאום עם הבעלים של ה-DW; הזמנת עבודה ליועץ; הפקת נקודת הבסיס למדדי ההשפעה</w:t>
-            </w:r>
-          </w:p>
-        </w:tc>
-        <w:tc>
-          <w:tcPr>
-            <w:tcW w:type="dxa" w:w="3244"/>
-            <w:tcBorders>
-              <w:top w:val="single" w:color="BFBFBF" w:sz="4"/>
-              <w:left w:val="single" w:color="BFBFBF" w:sz="4"/>
-              <w:bottom w:val="single" w:color="BFBFBF" w:sz="4"/>
-              <w:right w:val="single" w:color="BFBFBF" w:sz="4"/>
-            </w:tcBorders>
-            <w:tcMar>
-              <w:top w:type="dxa" w:w="60"/>
-              <w:left w:type="dxa" w:w="100"/>
-              <w:bottom w:type="dxa" w:w="60"/>
-              <w:right w:type="dxa" w:w="100"/>
-            </w:tcMar>
-          </w:tcPr>
-          <w:p>
-            <w:pPr>
-              <w:bidi/>
-              <w:spacing w:after="0"/>
-            </w:pPr>
-            <w:r>
-              <w:rPr>
-                <w:rFonts w:ascii="Arial" w:cs="Arial" w:eastAsia="Arial" w:hAnsi="Arial"/>
-                <w:sz w:val="19"/>
-                <w:szCs w:val="19"/>
-                <w:rtl/>
-              </w:rPr>
-              <w:t xml:space="preserve">DBA, Salesforce Admin, מנהל התמיכה</w:t>
+            <w:tcW w:type="dxa" w:w="5708"/>
+            <w:tcBorders>
+              <w:top w:val="single" w:color="BFBFBF" w:sz="4"/>
+              <w:left w:val="single" w:color="BFBFBF" w:sz="4"/>
+              <w:bottom w:val="single" w:color="BFBFBF" w:sz="4"/>
+              <w:right w:val="single" w:color="BFBFBF" w:sz="4"/>
+            </w:tcBorders>
+            <w:tcMar>
+              <w:top w:type="dxa" w:w="60"/>
+              <w:left w:type="dxa" w:w="100"/>
+              <w:bottom w:type="dxa" w:w="60"/>
+              <w:right w:type="dxa" w:w="100"/>
+            </w:tcMar>
+          </w:tcPr>
+          <w:p>
+            <w:pPr>
+              <w:bidi/>
+              <w:spacing w:after="0"/>
+            </w:pPr>
+            <w:r>
+              <w:rPr>
+                <w:rFonts w:ascii="Arial" w:cs="Arial" w:eastAsia="Arial" w:hAnsi="Arial"/>
+                <w:sz w:val="19"/>
+                <w:szCs w:val="19"/>
+                <w:rtl/>
+              </w:rPr>
+              <w:t xml:space="preserve">בדיקת הפער בפועל בין Salesforce ל-DW; אימות מנגנון הרענון האוטומטי מול ספק Spotfire; תיאום עם הבעלים של ה-DW; הזמנת עבודה ליועץ; הפקת נקודת הבסיס למדדי ההשפעה</w:t>
+            </w:r>
+          </w:p>
+        </w:tc>
+        <w:tc>
+          <w:tcPr>
+            <w:tcW w:type="dxa" w:w="2980"/>
+            <w:tcBorders>
+              <w:top w:val="single" w:color="BFBFBF" w:sz="4"/>
+              <w:left w:val="single" w:color="BFBFBF" w:sz="4"/>
+              <w:bottom w:val="single" w:color="BFBFBF" w:sz="4"/>
+              <w:right w:val="single" w:color="BFBFBF" w:sz="4"/>
+            </w:tcBorders>
+            <w:tcMar>
+              <w:top w:type="dxa" w:w="60"/>
+              <w:left w:type="dxa" w:w="100"/>
+              <w:bottom w:type="dxa" w:w="60"/>
+              <w:right w:type="dxa" w:w="100"/>
+            </w:tcMar>
+          </w:tcPr>
+          <w:p>
+            <w:pPr>
+              <w:bidi/>
+              <w:spacing w:after="0"/>
+            </w:pPr>
+            <w:r>
+              <w:rPr>
+                <w:rFonts w:ascii="Arial" w:cs="Arial" w:eastAsia="Arial" w:hAnsi="Arial"/>
+                <w:sz w:val="19"/>
+                <w:szCs w:val="19"/>
+                <w:rtl/>
+              </w:rPr>
+              <w:t xml:space="preserve">DBA, ספק Spotfire, מנהל התמיכה</w:t>
             </w:r>
           </w:p>
         </w:tc>
@@ -4390,39 +4888,39 @@
         </w:tc>
         <w:tc>
           <w:tcPr>
-            <w:tcW w:type="dxa" w:w="5444"/>
-            <w:tcBorders>
-              <w:top w:val="single" w:color="BFBFBF" w:sz="4"/>
-              <w:left w:val="single" w:color="BFBFBF" w:sz="4"/>
-              <w:bottom w:val="single" w:color="BFBFBF" w:sz="4"/>
-              <w:right w:val="single" w:color="BFBFBF" w:sz="4"/>
-            </w:tcBorders>
-            <w:tcMar>
-              <w:top w:type="dxa" w:w="60"/>
-              <w:left w:type="dxa" w:w="100"/>
-              <w:bottom w:type="dxa" w:w="60"/>
-              <w:right w:type="dxa" w:w="100"/>
-            </w:tcMar>
-          </w:tcPr>
-          <w:p>
-            <w:pPr>
-              <w:bidi/>
-              <w:spacing w:after="0"/>
-            </w:pPr>
-            <w:r>
-              <w:rPr>
-                <w:rFonts w:ascii="Arial" w:cs="Arial" w:eastAsia="Arial" w:hAnsi="Arial"/>
-                <w:sz w:val="19"/>
-                <w:szCs w:val="19"/>
-                <w:rtl/>
-              </w:rPr>
-              <w:t xml:space="preserve">טעינה אינקרמנטלית של ארבעת האובייקטים כל 5-15 דקות, ו-view אחד לכל רשימה במסך</w:t>
-            </w:r>
-          </w:p>
-        </w:tc>
-        <w:tc>
-          <w:tcPr>
-            <w:tcW w:type="dxa" w:w="3244"/>
+            <w:tcW w:type="dxa" w:w="5708"/>
+            <w:tcBorders>
+              <w:top w:val="single" w:color="BFBFBF" w:sz="4"/>
+              <w:left w:val="single" w:color="BFBFBF" w:sz="4"/>
+              <w:bottom w:val="single" w:color="BFBFBF" w:sz="4"/>
+              <w:right w:val="single" w:color="BFBFBF" w:sz="4"/>
+            </w:tcBorders>
+            <w:tcMar>
+              <w:top w:type="dxa" w:w="60"/>
+              <w:left w:type="dxa" w:w="100"/>
+              <w:bottom w:type="dxa" w:w="60"/>
+              <w:right w:type="dxa" w:w="100"/>
+            </w:tcMar>
+          </w:tcPr>
+          <w:p>
+            <w:pPr>
+              <w:bidi/>
+              <w:spacing w:after="0"/>
+            </w:pPr>
+            <w:r>
+              <w:rPr>
+                <w:rFonts w:ascii="Arial" w:cs="Arial" w:eastAsia="Arial" w:hAnsi="Arial"/>
+                <w:sz w:val="19"/>
+                <w:szCs w:val="19"/>
+                <w:rtl/>
+              </w:rPr>
+              <w:t xml:space="preserve">views ב-DW לרשומות פתוחות בלבד (P1, SLA בסיכון, בקשות לא משויכות) ואינדקסים מתאימים</w:t>
+            </w:r>
+          </w:p>
+        </w:tc>
+        <w:tc>
+          <w:tcPr>
+            <w:tcW w:type="dxa" w:w="2980"/>
             <w:tcBorders>
               <w:top w:val="single" w:color="BFBFBF" w:sz="4"/>
               <w:left w:val="single" w:color="BFBFBF" w:sz="4"/>
@@ -4493,39 +4991,39 @@
         </w:tc>
         <w:tc>
           <w:tcPr>
-            <w:tcW w:type="dxa" w:w="5444"/>
-            <w:tcBorders>
-              <w:top w:val="single" w:color="BFBFBF" w:sz="4"/>
-              <w:left w:val="single" w:color="BFBFBF" w:sz="4"/>
-              <w:bottom w:val="single" w:color="BFBFBF" w:sz="4"/>
-              <w:right w:val="single" w:color="BFBFBF" w:sz="4"/>
-            </w:tcBorders>
-            <w:tcMar>
-              <w:top w:type="dxa" w:w="60"/>
-              <w:left w:type="dxa" w:w="100"/>
-              <w:bottom w:type="dxa" w:w="60"/>
-              <w:right w:type="dxa" w:w="100"/>
-            </w:tcMar>
-          </w:tcPr>
-          <w:p>
-            <w:pPr>
-              <w:bidi/>
-              <w:spacing w:after="0"/>
-            </w:pPr>
-            <w:r>
-              <w:rPr>
-                <w:rFonts w:ascii="Arial" w:cs="Arial" w:eastAsia="Arial" w:hAnsi="Arial"/>
-                <w:sz w:val="19"/>
-                <w:szCs w:val="19"/>
-                <w:rtl/>
-              </w:rPr>
-              <w:t xml:space="preserve">בניית המסך ב-Spotfire, קישורים ל-Salesforce, הרשאות</w:t>
-            </w:r>
-          </w:p>
-        </w:tc>
-        <w:tc>
-          <w:tcPr>
-            <w:tcW w:type="dxa" w:w="3244"/>
+            <w:tcW w:type="dxa" w:w="5708"/>
+            <w:tcBorders>
+              <w:top w:val="single" w:color="BFBFBF" w:sz="4"/>
+              <w:left w:val="single" w:color="BFBFBF" w:sz="4"/>
+              <w:bottom w:val="single" w:color="BFBFBF" w:sz="4"/>
+              <w:right w:val="single" w:color="BFBFBF" w:sz="4"/>
+            </w:tcBorders>
+            <w:tcMar>
+              <w:top w:type="dxa" w:w="60"/>
+              <w:left w:type="dxa" w:w="100"/>
+              <w:bottom w:type="dxa" w:w="60"/>
+              <w:right w:type="dxa" w:w="100"/>
+            </w:tcMar>
+          </w:tcPr>
+          <w:p>
+            <w:pPr>
+              <w:bidi/>
+              <w:spacing w:after="0"/>
+            </w:pPr>
+            <w:r>
+              <w:rPr>
+                <w:rFonts w:ascii="Arial" w:cs="Arial" w:eastAsia="Arial" w:hAnsi="Arial"/>
+                <w:sz w:val="19"/>
+                <w:szCs w:val="19"/>
+                <w:rtl/>
+              </w:rPr>
+              <w:t xml:space="preserve">בניית המסך ב-Spotfire עם טבלאות in-database ורענון אוטומטי, קישורים ל-Salesforce, הרשאות</w:t>
+            </w:r>
+          </w:p>
+        </w:tc>
+        <w:tc>
+          <w:tcPr>
+            <w:tcW w:type="dxa" w:w="2980"/>
             <w:tcBorders>
               <w:top w:val="single" w:color="BFBFBF" w:sz="4"/>
               <w:left w:val="single" w:color="BFBFBF" w:sz="4"/>
@@ -4596,7 +5094,7 @@
         </w:tc>
         <w:tc>
           <w:tcPr>
-            <w:tcW w:type="dxa" w:w="5444"/>
+            <w:tcW w:type="dxa" w:w="5708"/>
             <w:tcBorders>
               <w:top w:val="single" w:color="BFBFBF" w:sz="4"/>
               <w:left w:val="single" w:color="BFBFBF" w:sz="4"/>
@@ -4628,7 +5126,7 @@
         </w:tc>
         <w:tc>
           <w:tcPr>
-            <w:tcW w:type="dxa" w:w="3244"/>
+            <w:tcW w:type="dxa" w:w="2980"/>
             <w:tcBorders>
               <w:top w:val="single" w:color="BFBFBF" w:sz="4"/>
               <w:left w:val="single" w:color="BFBFBF" w:sz="4"/>
@@ -4699,7 +5197,7 @@
         </w:tc>
         <w:tc>
           <w:tcPr>
-            <w:tcW w:type="dxa" w:w="5444"/>
+            <w:tcW w:type="dxa" w:w="5708"/>
             <w:tcBorders>
               <w:top w:val="single" w:color="BFBFBF" w:sz="4"/>
               <w:left w:val="single" w:color="BFBFBF" w:sz="4"/>
@@ -4731,7 +5229,7 @@
         </w:tc>
         <w:tc>
           <w:tcPr>
-            <w:tcW w:type="dxa" w:w="3244"/>
+            <w:tcW w:type="dxa" w:w="2980"/>
             <w:tcBorders>
               <w:top w:val="single" w:color="BFBFBF" w:sz="4"/>
               <w:left w:val="single" w:color="BFBFBF" w:sz="4"/>
@@ -4796,9 +5294,9 @@
         <w:tblLayout w:type="fixed"/>
       </w:tblPr>
       <w:tblGrid>
-        <w:gridCol w:w="3321"/>
-        <w:gridCol w:w="3387"/>
-        <w:gridCol w:w="2930"/>
+        <w:gridCol w:w="3506"/>
+        <w:gridCol w:w="3504"/>
+        <w:gridCol w:w="2628"/>
       </w:tblGrid>
       <w:tr>
         <w:trPr>
@@ -4806,7 +5304,7 @@
         </w:trPr>
         <w:tc>
           <w:tcPr>
-            <w:tcW w:type="dxa" w:w="3321"/>
+            <w:tcW w:type="dxa" w:w="3506"/>
             <w:tcBorders>
               <w:top w:val="single" w:color="BFBFBF" w:sz="4"/>
               <w:left w:val="single" w:color="BFBFBF" w:sz="4"/>
@@ -4841,7 +5339,7 @@
         </w:tc>
         <w:tc>
           <w:tcPr>
-            <w:tcW w:type="dxa" w:w="3387"/>
+            <w:tcW w:type="dxa" w:w="3504"/>
             <w:tcBorders>
               <w:top w:val="single" w:color="BFBFBF" w:sz="4"/>
               <w:left w:val="single" w:color="BFBFBF" w:sz="4"/>
@@ -4876,7 +5374,7 @@
         </w:tc>
         <w:tc>
           <w:tcPr>
-            <w:tcW w:type="dxa" w:w="2930"/>
+            <w:tcW w:type="dxa" w:w="2628"/>
             <w:tcBorders>
               <w:top w:val="single" w:color="BFBFBF" w:sz="4"/>
               <w:left w:val="single" w:color="BFBFBF" w:sz="4"/>
@@ -4916,39 +5414,39 @@
         </w:trPr>
         <w:tc>
           <w:tcPr>
-            <w:tcW w:type="dxa" w:w="3321"/>
-            <w:tcBorders>
-              <w:top w:val="single" w:color="BFBFBF" w:sz="4"/>
-              <w:left w:val="single" w:color="BFBFBF" w:sz="4"/>
-              <w:bottom w:val="single" w:color="BFBFBF" w:sz="4"/>
-              <w:right w:val="single" w:color="BFBFBF" w:sz="4"/>
-            </w:tcBorders>
-            <w:tcMar>
-              <w:top w:type="dxa" w:w="60"/>
-              <w:left w:type="dxa" w:w="100"/>
-              <w:bottom w:type="dxa" w:w="60"/>
-              <w:right w:type="dxa" w:w="100"/>
-            </w:tcMar>
-          </w:tcPr>
-          <w:p>
-            <w:pPr>
-              <w:bidi/>
-              <w:spacing w:after="0"/>
-            </w:pPr>
-            <w:r>
-              <w:rPr>
-                <w:rFonts w:ascii="Arial" w:cs="Arial" w:eastAsia="Arial" w:hAnsi="Arial"/>
-                <w:sz w:val="19"/>
-                <w:szCs w:val="19"/>
-                <w:rtl/>
-              </w:rPr>
-              <w:t xml:space="preserve">יועץ Spotfire: מסך אחד, קישורים, בדיקות והעברה ל-IT</w:t>
-            </w:r>
-          </w:p>
-        </w:tc>
-        <w:tc>
-          <w:tcPr>
-            <w:tcW w:type="dxa" w:w="3387"/>
+            <w:tcW w:type="dxa" w:w="3506"/>
+            <w:tcBorders>
+              <w:top w:val="single" w:color="BFBFBF" w:sz="4"/>
+              <w:left w:val="single" w:color="BFBFBF" w:sz="4"/>
+              <w:bottom w:val="single" w:color="BFBFBF" w:sz="4"/>
+              <w:right w:val="single" w:color="BFBFBF" w:sz="4"/>
+            </w:tcBorders>
+            <w:tcMar>
+              <w:top w:type="dxa" w:w="60"/>
+              <w:left w:type="dxa" w:w="100"/>
+              <w:bottom w:type="dxa" w:w="60"/>
+              <w:right w:type="dxa" w:w="100"/>
+            </w:tcMar>
+          </w:tcPr>
+          <w:p>
+            <w:pPr>
+              <w:bidi/>
+              <w:spacing w:after="0"/>
+            </w:pPr>
+            <w:r>
+              <w:rPr>
+                <w:rFonts w:ascii="Arial" w:cs="Arial" w:eastAsia="Arial" w:hAnsi="Arial"/>
+                <w:sz w:val="19"/>
+                <w:szCs w:val="19"/>
+                <w:rtl/>
+              </w:rPr>
+              <w:t xml:space="preserve">יועץ Spotfire: מסך אחד, רענון אוטומטי, קישורים, בדיקות והעברה ל-IT</w:t>
+            </w:r>
+          </w:p>
+        </w:tc>
+        <w:tc>
+          <w:tcPr>
+            <w:tcW w:type="dxa" w:w="3504"/>
             <w:tcBorders>
               <w:top w:val="single" w:color="BFBFBF" w:sz="4"/>
               <w:left w:val="single" w:color="BFBFBF" w:sz="4"/>
@@ -4980,7 +5478,7 @@
         </w:tc>
         <w:tc>
           <w:tcPr>
-            <w:tcW w:type="dxa" w:w="2930"/>
+            <w:tcW w:type="dxa" w:w="2628"/>
             <w:tcBorders>
               <w:top w:val="single" w:color="BFBFBF" w:sz="4"/>
               <w:left w:val="single" w:color="BFBFBF" w:sz="4"/>
@@ -5017,7 +5515,7 @@
         </w:trPr>
         <w:tc>
           <w:tcPr>
-            <w:tcW w:type="dxa" w:w="3321"/>
+            <w:tcW w:type="dxa" w:w="3506"/>
             <w:tcBorders>
               <w:top w:val="single" w:color="BFBFBF" w:sz="4"/>
               <w:left w:val="single" w:color="BFBFBF" w:sz="4"/>
@@ -5049,7 +5547,7 @@
         </w:tc>
         <w:tc>
           <w:tcPr>
-            <w:tcW w:type="dxa" w:w="3387"/>
+            <w:tcW w:type="dxa" w:w="3504"/>
             <w:tcBorders>
               <w:top w:val="single" w:color="BFBFBF" w:sz="4"/>
               <w:left w:val="single" w:color="BFBFBF" w:sz="4"/>
@@ -5081,7 +5579,7 @@
         </w:tc>
         <w:tc>
           <w:tcPr>
-            <w:tcW w:type="dxa" w:w="2930"/>
+            <w:tcW w:type="dxa" w:w="2628"/>
             <w:tcBorders>
               <w:top w:val="single" w:color="BFBFBF" w:sz="4"/>
               <w:left w:val="single" w:color="BFBFBF" w:sz="4"/>
@@ -5118,7 +5616,7 @@
         </w:trPr>
         <w:tc>
           <w:tcPr>
-            <w:tcW w:type="dxa" w:w="3321"/>
+            <w:tcW w:type="dxa" w:w="3506"/>
             <w:tcBorders>
               <w:top w:val="single" w:color="BFBFBF" w:sz="4"/>
               <w:left w:val="single" w:color="BFBFBF" w:sz="4"/>
@@ -5150,39 +5648,39 @@
         </w:tc>
         <w:tc>
           <w:tcPr>
-            <w:tcW w:type="dxa" w:w="3387"/>
-            <w:tcBorders>
-              <w:top w:val="single" w:color="BFBFBF" w:sz="4"/>
-              <w:left w:val="single" w:color="BFBFBF" w:sz="4"/>
-              <w:bottom w:val="single" w:color="BFBFBF" w:sz="4"/>
-              <w:right w:val="single" w:color="BFBFBF" w:sz="4"/>
-            </w:tcBorders>
-            <w:tcMar>
-              <w:top w:type="dxa" w:w="60"/>
-              <w:left w:type="dxa" w:w="100"/>
-              <w:bottom w:type="dxa" w:w="60"/>
-              <w:right w:type="dxa" w:w="100"/>
-            </w:tcMar>
-          </w:tcPr>
-          <w:p>
-            <w:pPr>
-              <w:bidi/>
-              <w:spacing w:after="0"/>
-            </w:pPr>
-            <w:r>
-              <w:rPr>
-                <w:rFonts w:ascii="Arial" w:cs="Arial" w:eastAsia="Arial" w:hAnsi="Arial"/>
-                <w:sz w:val="19"/>
-                <w:szCs w:val="19"/>
-                <w:rtl/>
-              </w:rPr>
-              <w:t xml:space="preserve">כ-5-8 ימי עבודה (תלוי בתדירות העדכון הקיימת של ה-DW)</w:t>
-            </w:r>
-          </w:p>
-        </w:tc>
-        <w:tc>
-          <w:tcPr>
-            <w:tcW w:type="dxa" w:w="2930"/>
+            <w:tcW w:type="dxa" w:w="3504"/>
+            <w:tcBorders>
+              <w:top w:val="single" w:color="BFBFBF" w:sz="4"/>
+              <w:left w:val="single" w:color="BFBFBF" w:sz="4"/>
+              <w:bottom w:val="single" w:color="BFBFBF" w:sz="4"/>
+              <w:right w:val="single" w:color="BFBFBF" w:sz="4"/>
+            </w:tcBorders>
+            <w:tcMar>
+              <w:top w:type="dxa" w:w="60"/>
+              <w:left w:type="dxa" w:w="100"/>
+              <w:bottom w:type="dxa" w:w="60"/>
+              <w:right w:type="dxa" w:w="100"/>
+            </w:tcMar>
+          </w:tcPr>
+          <w:p>
+            <w:pPr>
+              <w:bidi/>
+              <w:spacing w:after="0"/>
+            </w:pPr>
+            <w:r>
+              <w:rPr>
+                <w:rFonts w:ascii="Arial" w:cs="Arial" w:eastAsia="Arial" w:hAnsi="Arial"/>
+                <w:sz w:val="19"/>
+                <w:szCs w:val="19"/>
+                <w:rtl/>
+              </w:rPr>
+              <w:t xml:space="preserve">כ-2-4 ימי עבודה (views בלבד; אין צורך בטעינה נוספת, כי ה-DW מתעדכן בזמן אמת)</w:t>
+            </w:r>
+          </w:p>
+        </w:tc>
+        <w:tc>
+          <w:tcPr>
+            <w:tcW w:type="dxa" w:w="2628"/>
             <w:tcBorders>
               <w:top w:val="single" w:color="BFBFBF" w:sz="4"/>
               <w:left w:val="single" w:color="BFBFBF" w:sz="4"/>
@@ -5219,7 +5717,7 @@
         </w:trPr>
         <w:tc>
           <w:tcPr>
-            <w:tcW w:type="dxa" w:w="3321"/>
+            <w:tcW w:type="dxa" w:w="3506"/>
             <w:tcBorders>
               <w:top w:val="single" w:color="BFBFBF" w:sz="4"/>
               <w:left w:val="single" w:color="BFBFBF" w:sz="4"/>
@@ -5251,7 +5749,7 @@
         </w:tc>
         <w:tc>
           <w:tcPr>
-            <w:tcW w:type="dxa" w:w="3387"/>
+            <w:tcW w:type="dxa" w:w="3504"/>
             <w:tcBorders>
               <w:top w:val="single" w:color="BFBFBF" w:sz="4"/>
               <w:left w:val="single" w:color="BFBFBF" w:sz="4"/>
@@ -5283,7 +5781,7 @@
         </w:tc>
         <w:tc>
           <w:tcPr>
-            <w:tcW w:type="dxa" w:w="2930"/>
+            <w:tcW w:type="dxa" w:w="2628"/>
             <w:tcBorders>
               <w:top w:val="single" w:color="BFBFBF" w:sz="4"/>
               <w:left w:val="single" w:color="BFBFBF" w:sz="4"/>
@@ -5320,7 +5818,7 @@
         </w:trPr>
         <w:tc>
           <w:tcPr>
-            <w:tcW w:type="dxa" w:w="3321"/>
+            <w:tcW w:type="dxa" w:w="3506"/>
             <w:tcBorders>
               <w:top w:val="single" w:color="BFBFBF" w:sz="4"/>
               <w:left w:val="single" w:color="BFBFBF" w:sz="4"/>
@@ -5352,7 +5850,7 @@
         </w:tc>
         <w:tc>
           <w:tcPr>
-            <w:tcW w:type="dxa" w:w="3387"/>
+            <w:tcW w:type="dxa" w:w="3504"/>
             <w:tcBorders>
               <w:top w:val="single" w:color="BFBFBF" w:sz="4"/>
               <w:left w:val="single" w:color="BFBFBF" w:sz="4"/>
@@ -5384,7 +5882,7 @@
         </w:tc>
         <w:tc>
           <w:tcPr>
-            <w:tcW w:type="dxa" w:w="2930"/>
+            <w:tcW w:type="dxa" w:w="2628"/>
             <w:tcBorders>
               <w:top w:val="single" w:color="BFBFBF" w:sz="4"/>
               <w:left w:val="single" w:color="BFBFBF" w:sz="4"/>
@@ -5764,6 +6262,12 @@
       <w:startOverride w:val="1"/>
     </w:lvlOverride>
   </w:num>
+  <w:num w:numId="2">
+    <w:abstractNumId w:val="3"/>
+    <w:lvlOverride w:ilvl="0">
+      <w:startOverride w:val="1"/>
+    </w:lvlOverride>
+  </w:num>
 </w:numbering>
 </file>
 

</xml_diff>

<commit_message>
Consultant builds with an in-house developer on latest Spotfire
The developer has no Spotfire experience, so an external consultant
builds the MVP while the developer pairs full time and builds the
simpler native parts (KPI tiles, Salesforce links, stale-data warning,
phone layout). Adds a knowledge-transfer model with contract terms and
done criteria, a 5-week plan, consultant and developer effort, wave-2
estimates with a learning margin, and new risks. Action mods are
available on the latest Spotfire; refresh on a timer still needs a
week-1 check. Short MVP aligned to 5 weeks and the same team model.

Co-Authored-By: Claude Opus 5.5 <noreply@anthropic.com>
Claude-Session: https://claude.ai/code/session_01YcEMp91cmPuH2YbvGBFx73
</commit_message>
<xml_diff>
--- a/docs/MVP-Short.docx
+++ b/docs/MVP-Short.docx
@@ -100,7 +100,7 @@
                 <w:szCs w:val="19"/>
                 <w:rtl/>
               </w:rPr>
-              <w:t xml:space="preserve">2.0 (היקף מצומצם בגלל לוח זמנים)</w:t>
+              <w:t xml:space="preserve">2.1 (היקף מצומצם; יועץ ומפתח פנימי)</w:t>
             </w:r>
           </w:p>
         </w:tc>
@@ -172,7 +172,7 @@
                 <w:szCs w:val="19"/>
                 <w:rtl/>
               </w:rPr>
-              <w:t xml:space="preserve">2026-10-08</w:t>
+              <w:t xml:space="preserve">2026-10-12</w:t>
             </w:r>
           </w:p>
         </w:tc>
@@ -3027,7 +3027,7 @@
           <w:rFonts w:ascii="Arial" w:cs="Arial" w:eastAsia="Arial" w:hAnsi="Arial"/>
           <w:rtl/>
         </w:rPr>
-        <w:t xml:space="preserve"> צריך לברר מול הספק מה גרסת Spotfire Cloud שלכם תומכת בו. לא מצאתי תיעוד רשמי לרענון אוטומטי ברמת שניות. הפתרון המקובל בקהילה הוא סקריפט קטן בתוך הניתוח שמרענן את הטבלאות כל X שניות, והיועץ יבנה אותו אם אין אפשרות מובנית.</w:t>
+        <w:t xml:space="preserve"> Spotfire אצלכם בגרסה האחרונה, ולכן Action mods זמינים. צריך לבדוק אם אפשר להפעיל אותם לפי טיימר, ולא רק בלחיצה. לא מצאתי תיעוד רשמי לרענון אוטומטי ברמת שניות. החלופה המקובלת בקהילה היא סקריפט קטן בתוך הניתוח שמרענן את הטבלאות כל X שניות, והיועץ יבנה אותו אם אין אפשרות מובנית.</w:t>
       </w:r>
     </w:p>
     <w:p>
@@ -4613,7 +4613,37 @@
           <w:rFonts w:ascii="Arial" w:cs="Arial" w:eastAsia="Arial" w:hAnsi="Arial"/>
           <w:rtl/>
         </w:rPr>
-        <w:t xml:space="preserve">5.1 לוח זמנים: 4 שבועות עד העלייה לאוויר, ועוד 4 שבועות ניסוי</w:t>
+        <w:t xml:space="preserve">5.1 לוח זמנים: 5 שבועות עד העלייה לאוויר, ועוד 4 שבועות ניסוי</w:t>
+      </w:r>
+    </w:p>
+    <w:p>
+      <w:pPr>
+        <w:bidi/>
+        <w:spacing w:after="120" w:line="276"/>
+        <w:jc w:val="start"/>
+      </w:pPr>
+      <w:r>
+        <w:rPr>
+          <w:rFonts w:ascii="Arial" w:cs="Arial" w:eastAsia="Arial" w:hAnsi="Arial"/>
+          <w:rtl/>
+        </w:rPr>
+        <w:t xml:space="preserve">מי בונה: </w:t>
+      </w:r>
+      <w:r>
+        <w:rPr>
+          <w:rFonts w:ascii="Arial" w:cs="Arial" w:eastAsia="Arial" w:hAnsi="Arial"/>
+          <w:b/>
+          <w:bCs/>
+          <w:rtl/>
+        </w:rPr>
+        <w:t xml:space="preserve">יועץ Spotfire חיצוני, ומפתח פנימי שעובד איתו צמוד ומקבל לידיו את המערכת.</w:t>
+      </w:r>
+      <w:r>
+        <w:rPr>
+          <w:rFonts w:ascii="Arial" w:cs="Arial" w:eastAsia="Arial" w:hAnsi="Arial"/>
+          <w:rtl/>
+        </w:rPr>
+        <w:t xml:space="preserve"> הפירוט המלא, כולל מודל העברת הידע, נמצא במסמך MVP-InHouse.</w:t>
       </w:r>
     </w:p>
     <w:tbl>
@@ -4632,8 +4662,8 @@
       </w:tblPr>
       <w:tblGrid>
         <w:gridCol w:w="950"/>
-        <w:gridCol w:w="5708"/>
-        <w:gridCol w:w="2980"/>
+        <w:gridCol w:w="5848"/>
+        <w:gridCol w:w="2840"/>
       </w:tblGrid>
       <w:tr>
         <w:trPr>
@@ -4676,7 +4706,7 @@
         </w:tc>
         <w:tc>
           <w:tcPr>
-            <w:tcW w:type="dxa" w:w="5708"/>
+            <w:tcW w:type="dxa" w:w="5848"/>
             <w:tcBorders>
               <w:top w:val="single" w:color="BFBFBF" w:sz="4"/>
               <w:left w:val="single" w:color="BFBFBF" w:sz="4"/>
@@ -4711,7 +4741,7 @@
         </w:tc>
         <w:tc>
           <w:tcPr>
-            <w:tcW w:type="dxa" w:w="2980"/>
+            <w:tcW w:type="dxa" w:w="2840"/>
             <w:tcBorders>
               <w:top w:val="single" w:color="BFBFBF" w:sz="4"/>
               <w:left w:val="single" w:color="BFBFBF" w:sz="4"/>
@@ -4779,71 +4809,71 @@
                 <w:szCs w:val="19"/>
                 <w:rtl/>
               </w:rPr>
-              <w:t xml:space="preserve">1</w:t>
-            </w:r>
-          </w:p>
-        </w:tc>
-        <w:tc>
-          <w:tcPr>
-            <w:tcW w:type="dxa" w:w="5708"/>
-            <w:tcBorders>
-              <w:top w:val="single" w:color="BFBFBF" w:sz="4"/>
-              <w:left w:val="single" w:color="BFBFBF" w:sz="4"/>
-              <w:bottom w:val="single" w:color="BFBFBF" w:sz="4"/>
-              <w:right w:val="single" w:color="BFBFBF" w:sz="4"/>
-            </w:tcBorders>
-            <w:tcMar>
-              <w:top w:type="dxa" w:w="60"/>
-              <w:left w:type="dxa" w:w="100"/>
-              <w:bottom w:type="dxa" w:w="60"/>
-              <w:right w:type="dxa" w:w="100"/>
-            </w:tcMar>
-          </w:tcPr>
-          <w:p>
-            <w:pPr>
-              <w:bidi/>
-              <w:spacing w:after="0"/>
-            </w:pPr>
-            <w:r>
-              <w:rPr>
-                <w:rFonts w:ascii="Arial" w:cs="Arial" w:eastAsia="Arial" w:hAnsi="Arial"/>
-                <w:sz w:val="19"/>
-                <w:szCs w:val="19"/>
-                <w:rtl/>
-              </w:rPr>
-              <w:t xml:space="preserve">בדיקת הפער בפועל בין Salesforce ל-DW; אימות מנגנון הרענון האוטומטי מול ספק Spotfire; תיאום עם הבעלים של ה-DW; הזמנת עבודה ליועץ; הפקת נקודת הבסיס למדדי ההשפעה</w:t>
-            </w:r>
-          </w:p>
-        </w:tc>
-        <w:tc>
-          <w:tcPr>
-            <w:tcW w:type="dxa" w:w="2980"/>
-            <w:tcBorders>
-              <w:top w:val="single" w:color="BFBFBF" w:sz="4"/>
-              <w:left w:val="single" w:color="BFBFBF" w:sz="4"/>
-              <w:bottom w:val="single" w:color="BFBFBF" w:sz="4"/>
-              <w:right w:val="single" w:color="BFBFBF" w:sz="4"/>
-            </w:tcBorders>
-            <w:tcMar>
-              <w:top w:type="dxa" w:w="60"/>
-              <w:left w:type="dxa" w:w="100"/>
-              <w:bottom w:type="dxa" w:w="60"/>
-              <w:right w:type="dxa" w:w="100"/>
-            </w:tcMar>
-          </w:tcPr>
-          <w:p>
-            <w:pPr>
-              <w:bidi/>
-              <w:spacing w:after="0"/>
-            </w:pPr>
-            <w:r>
-              <w:rPr>
-                <w:rFonts w:ascii="Arial" w:cs="Arial" w:eastAsia="Arial" w:hAnsi="Arial"/>
-                <w:sz w:val="19"/>
-                <w:szCs w:val="19"/>
-                <w:rtl/>
-              </w:rPr>
-              <w:t xml:space="preserve">DBA, ספק Spotfire, מנהל התמיכה</w:t>
+              <w:t xml:space="preserve">לפני</w:t>
+            </w:r>
+          </w:p>
+        </w:tc>
+        <w:tc>
+          <w:tcPr>
+            <w:tcW w:type="dxa" w:w="5848"/>
+            <w:tcBorders>
+              <w:top w:val="single" w:color="BFBFBF" w:sz="4"/>
+              <w:left w:val="single" w:color="BFBFBF" w:sz="4"/>
+              <w:bottom w:val="single" w:color="BFBFBF" w:sz="4"/>
+              <w:right w:val="single" w:color="BFBFBF" w:sz="4"/>
+            </w:tcBorders>
+            <w:tcMar>
+              <w:top w:type="dxa" w:w="60"/>
+              <w:left w:type="dxa" w:w="100"/>
+              <w:bottom w:type="dxa" w:w="60"/>
+              <w:right w:type="dxa" w:w="100"/>
+            </w:tcMar>
+          </w:tcPr>
+          <w:p>
+            <w:pPr>
+              <w:bidi/>
+              <w:spacing w:after="0"/>
+            </w:pPr>
+            <w:r>
+              <w:rPr>
+                <w:rFonts w:ascii="Arial" w:cs="Arial" w:eastAsia="Arial" w:hAnsi="Arial"/>
+                <w:sz w:val="19"/>
+                <w:szCs w:val="19"/>
+                <w:rtl/>
+              </w:rPr>
+              <w:t xml:space="preserve">קורס Spotfire בסיסי למפתח (כ-2-3 ימים). הזמנת עבודה ליועץ</w:t>
+            </w:r>
+          </w:p>
+        </w:tc>
+        <w:tc>
+          <w:tcPr>
+            <w:tcW w:type="dxa" w:w="2840"/>
+            <w:tcBorders>
+              <w:top w:val="single" w:color="BFBFBF" w:sz="4"/>
+              <w:left w:val="single" w:color="BFBFBF" w:sz="4"/>
+              <w:bottom w:val="single" w:color="BFBFBF" w:sz="4"/>
+              <w:right w:val="single" w:color="BFBFBF" w:sz="4"/>
+            </w:tcBorders>
+            <w:tcMar>
+              <w:top w:type="dxa" w:w="60"/>
+              <w:left w:type="dxa" w:w="100"/>
+              <w:bottom w:type="dxa" w:w="60"/>
+              <w:right w:type="dxa" w:w="100"/>
+            </w:tcMar>
+          </w:tcPr>
+          <w:p>
+            <w:pPr>
+              <w:bidi/>
+              <w:spacing w:after="0"/>
+            </w:pPr>
+            <w:r>
+              <w:rPr>
+                <w:rFonts w:ascii="Arial" w:cs="Arial" w:eastAsia="Arial" w:hAnsi="Arial"/>
+                <w:sz w:val="19"/>
+                <w:szCs w:val="19"/>
+                <w:rtl/>
+              </w:rPr>
+              <w:t xml:space="preserve">מפתח, מנהל התמיכה</w:t>
             </w:r>
           </w:p>
         </w:tc>
@@ -4882,71 +4912,71 @@
                 <w:szCs w:val="19"/>
                 <w:rtl/>
               </w:rPr>
-              <w:t xml:space="preserve">2</w:t>
-            </w:r>
-          </w:p>
-        </w:tc>
-        <w:tc>
-          <w:tcPr>
-            <w:tcW w:type="dxa" w:w="5708"/>
-            <w:tcBorders>
-              <w:top w:val="single" w:color="BFBFBF" w:sz="4"/>
-              <w:left w:val="single" w:color="BFBFBF" w:sz="4"/>
-              <w:bottom w:val="single" w:color="BFBFBF" w:sz="4"/>
-              <w:right w:val="single" w:color="BFBFBF" w:sz="4"/>
-            </w:tcBorders>
-            <w:tcMar>
-              <w:top w:type="dxa" w:w="60"/>
-              <w:left w:type="dxa" w:w="100"/>
-              <w:bottom w:type="dxa" w:w="60"/>
-              <w:right w:type="dxa" w:w="100"/>
-            </w:tcMar>
-          </w:tcPr>
-          <w:p>
-            <w:pPr>
-              <w:bidi/>
-              <w:spacing w:after="0"/>
-            </w:pPr>
-            <w:r>
-              <w:rPr>
-                <w:rFonts w:ascii="Arial" w:cs="Arial" w:eastAsia="Arial" w:hAnsi="Arial"/>
-                <w:sz w:val="19"/>
-                <w:szCs w:val="19"/>
-                <w:rtl/>
-              </w:rPr>
-              <w:t xml:space="preserve">views ב-DW לרשומות פתוחות בלבד (P1, SLA בסיכון, בקשות לא משויכות) ואינדקסים מתאימים</w:t>
-            </w:r>
-          </w:p>
-        </w:tc>
-        <w:tc>
-          <w:tcPr>
-            <w:tcW w:type="dxa" w:w="2980"/>
-            <w:tcBorders>
-              <w:top w:val="single" w:color="BFBFBF" w:sz="4"/>
-              <w:left w:val="single" w:color="BFBFBF" w:sz="4"/>
-              <w:bottom w:val="single" w:color="BFBFBF" w:sz="4"/>
-              <w:right w:val="single" w:color="BFBFBF" w:sz="4"/>
-            </w:tcBorders>
-            <w:tcMar>
-              <w:top w:type="dxa" w:w="60"/>
-              <w:left w:type="dxa" w:w="100"/>
-              <w:bottom w:type="dxa" w:w="60"/>
-              <w:right w:type="dxa" w:w="100"/>
-            </w:tcMar>
-          </w:tcPr>
-          <w:p>
-            <w:pPr>
-              <w:bidi/>
-              <w:spacing w:after="0"/>
-            </w:pPr>
-            <w:r>
-              <w:rPr>
-                <w:rFonts w:ascii="Arial" w:cs="Arial" w:eastAsia="Arial" w:hAnsi="Arial"/>
-                <w:sz w:val="19"/>
-                <w:szCs w:val="19"/>
-                <w:rtl/>
-              </w:rPr>
-              <w:t xml:space="preserve">DBA</w:t>
+              <w:t xml:space="preserve">1</w:t>
+            </w:r>
+          </w:p>
+        </w:tc>
+        <w:tc>
+          <w:tcPr>
+            <w:tcW w:type="dxa" w:w="5848"/>
+            <w:tcBorders>
+              <w:top w:val="single" w:color="BFBFBF" w:sz="4"/>
+              <w:left w:val="single" w:color="BFBFBF" w:sz="4"/>
+              <w:bottom w:val="single" w:color="BFBFBF" w:sz="4"/>
+              <w:right w:val="single" w:color="BFBFBF" w:sz="4"/>
+            </w:tcBorders>
+            <w:tcMar>
+              <w:top w:type="dxa" w:w="60"/>
+              <w:left w:type="dxa" w:w="100"/>
+              <w:bottom w:type="dxa" w:w="60"/>
+              <w:right w:type="dxa" w:w="100"/>
+            </w:tcMar>
+          </w:tcPr>
+          <w:p>
+            <w:pPr>
+              <w:bidi/>
+              <w:spacing w:after="0"/>
+            </w:pPr>
+            <w:r>
+              <w:rPr>
+                <w:rFonts w:ascii="Arial" w:cs="Arial" w:eastAsia="Arial" w:hAnsi="Arial"/>
+                <w:sz w:val="19"/>
+                <w:szCs w:val="19"/>
+                <w:rtl/>
+              </w:rPr>
+              <w:t xml:space="preserve">בדיקת היתכנות של רענון אוטומטי (עמוד אחד, במחשב, במסך הקיר ובטלפון); בדיקת הפער בפועל בין Salesforce ל-DW; תיאום עם הבעלים של ה-DW; הפקת נקודת הבסיס למדדי ההשפעה</w:t>
+            </w:r>
+          </w:p>
+        </w:tc>
+        <w:tc>
+          <w:tcPr>
+            <w:tcW w:type="dxa" w:w="2840"/>
+            <w:tcBorders>
+              <w:top w:val="single" w:color="BFBFBF" w:sz="4"/>
+              <w:left w:val="single" w:color="BFBFBF" w:sz="4"/>
+              <w:bottom w:val="single" w:color="BFBFBF" w:sz="4"/>
+              <w:right w:val="single" w:color="BFBFBF" w:sz="4"/>
+            </w:tcBorders>
+            <w:tcMar>
+              <w:top w:type="dxa" w:w="60"/>
+              <w:left w:type="dxa" w:w="100"/>
+              <w:bottom w:type="dxa" w:w="60"/>
+              <w:right w:type="dxa" w:w="100"/>
+            </w:tcMar>
+          </w:tcPr>
+          <w:p>
+            <w:pPr>
+              <w:bidi/>
+              <w:spacing w:after="0"/>
+            </w:pPr>
+            <w:r>
+              <w:rPr>
+                <w:rFonts w:ascii="Arial" w:cs="Arial" w:eastAsia="Arial" w:hAnsi="Arial"/>
+                <w:sz w:val="19"/>
+                <w:szCs w:val="19"/>
+                <w:rtl/>
+              </w:rPr>
+              <w:t xml:space="preserve">יועץ, מפתח, DBA, מנהל התמיכה</w:t>
             </w:r>
           </w:p>
         </w:tc>
@@ -4985,71 +5015,71 @@
                 <w:szCs w:val="19"/>
                 <w:rtl/>
               </w:rPr>
-              <w:t xml:space="preserve">3</w:t>
-            </w:r>
-          </w:p>
-        </w:tc>
-        <w:tc>
-          <w:tcPr>
-            <w:tcW w:type="dxa" w:w="5708"/>
-            <w:tcBorders>
-              <w:top w:val="single" w:color="BFBFBF" w:sz="4"/>
-              <w:left w:val="single" w:color="BFBFBF" w:sz="4"/>
-              <w:bottom w:val="single" w:color="BFBFBF" w:sz="4"/>
-              <w:right w:val="single" w:color="BFBFBF" w:sz="4"/>
-            </w:tcBorders>
-            <w:tcMar>
-              <w:top w:type="dxa" w:w="60"/>
-              <w:left w:type="dxa" w:w="100"/>
-              <w:bottom w:type="dxa" w:w="60"/>
-              <w:right w:type="dxa" w:w="100"/>
-            </w:tcMar>
-          </w:tcPr>
-          <w:p>
-            <w:pPr>
-              <w:bidi/>
-              <w:spacing w:after="0"/>
-            </w:pPr>
-            <w:r>
-              <w:rPr>
-                <w:rFonts w:ascii="Arial" w:cs="Arial" w:eastAsia="Arial" w:hAnsi="Arial"/>
-                <w:sz w:val="19"/>
-                <w:szCs w:val="19"/>
-                <w:rtl/>
-              </w:rPr>
-              <w:t xml:space="preserve">בניית המסך ב-Spotfire עם טבלאות in-database ורענון אוטומטי, קישורים ל-Salesforce, הרשאות</w:t>
-            </w:r>
-          </w:p>
-        </w:tc>
-        <w:tc>
-          <w:tcPr>
-            <w:tcW w:type="dxa" w:w="2980"/>
-            <w:tcBorders>
-              <w:top w:val="single" w:color="BFBFBF" w:sz="4"/>
-              <w:left w:val="single" w:color="BFBFBF" w:sz="4"/>
-              <w:bottom w:val="single" w:color="BFBFBF" w:sz="4"/>
-              <w:right w:val="single" w:color="BFBFBF" w:sz="4"/>
-            </w:tcBorders>
-            <w:tcMar>
-              <w:top w:type="dxa" w:w="60"/>
-              <w:left w:type="dxa" w:w="100"/>
-              <w:bottom w:type="dxa" w:w="60"/>
-              <w:right w:type="dxa" w:w="100"/>
-            </w:tcMar>
-          </w:tcPr>
-          <w:p>
-            <w:pPr>
-              <w:bidi/>
-              <w:spacing w:after="0"/>
-            </w:pPr>
-            <w:r>
-              <w:rPr>
-                <w:rFonts w:ascii="Arial" w:cs="Arial" w:eastAsia="Arial" w:hAnsi="Arial"/>
-                <w:sz w:val="19"/>
-                <w:szCs w:val="19"/>
-                <w:rtl/>
-              </w:rPr>
-              <w:t xml:space="preserve">יועץ</w:t>
+              <w:t xml:space="preserve">2</w:t>
+            </w:r>
+          </w:p>
+        </w:tc>
+        <w:tc>
+          <w:tcPr>
+            <w:tcW w:type="dxa" w:w="5848"/>
+            <w:tcBorders>
+              <w:top w:val="single" w:color="BFBFBF" w:sz="4"/>
+              <w:left w:val="single" w:color="BFBFBF" w:sz="4"/>
+              <w:bottom w:val="single" w:color="BFBFBF" w:sz="4"/>
+              <w:right w:val="single" w:color="BFBFBF" w:sz="4"/>
+            </w:tcBorders>
+            <w:tcMar>
+              <w:top w:type="dxa" w:w="60"/>
+              <w:left w:type="dxa" w:w="100"/>
+              <w:bottom w:type="dxa" w:w="60"/>
+              <w:right w:type="dxa" w:w="100"/>
+            </w:tcMar>
+          </w:tcPr>
+          <w:p>
+            <w:pPr>
+              <w:bidi/>
+              <w:spacing w:after="0"/>
+            </w:pPr>
+            <w:r>
+              <w:rPr>
+                <w:rFonts w:ascii="Arial" w:cs="Arial" w:eastAsia="Arial" w:hAnsi="Arial"/>
+                <w:sz w:val="19"/>
+                <w:szCs w:val="19"/>
+                <w:rtl/>
+              </w:rPr>
+              <w:t xml:space="preserve">views ב-DW לרשומות פתוחות בלבד (P1, SLA בסיכון, בקשות לא משויכות) ואינדקסים מתאימים</w:t>
+            </w:r>
+          </w:p>
+        </w:tc>
+        <w:tc>
+          <w:tcPr>
+            <w:tcW w:type="dxa" w:w="2840"/>
+            <w:tcBorders>
+              <w:top w:val="single" w:color="BFBFBF" w:sz="4"/>
+              <w:left w:val="single" w:color="BFBFBF" w:sz="4"/>
+              <w:bottom w:val="single" w:color="BFBFBF" w:sz="4"/>
+              <w:right w:val="single" w:color="BFBFBF" w:sz="4"/>
+            </w:tcBorders>
+            <w:tcMar>
+              <w:top w:type="dxa" w:w="60"/>
+              <w:left w:type="dxa" w:w="100"/>
+              <w:bottom w:type="dxa" w:w="60"/>
+              <w:right w:type="dxa" w:w="100"/>
+            </w:tcMar>
+          </w:tcPr>
+          <w:p>
+            <w:pPr>
+              <w:bidi/>
+              <w:spacing w:after="0"/>
+            </w:pPr>
+            <w:r>
+              <w:rPr>
+                <w:rFonts w:ascii="Arial" w:cs="Arial" w:eastAsia="Arial" w:hAnsi="Arial"/>
+                <w:sz w:val="19"/>
+                <w:szCs w:val="19"/>
+                <w:rtl/>
+              </w:rPr>
+              <w:t xml:space="preserve">DBA</w:t>
             </w:r>
           </w:p>
         </w:tc>
@@ -5088,71 +5118,71 @@
                 <w:szCs w:val="19"/>
                 <w:rtl/>
               </w:rPr>
-              <w:t xml:space="preserve">4</w:t>
-            </w:r>
-          </w:p>
-        </w:tc>
-        <w:tc>
-          <w:tcPr>
-            <w:tcW w:type="dxa" w:w="5708"/>
-            <w:tcBorders>
-              <w:top w:val="single" w:color="BFBFBF" w:sz="4"/>
-              <w:left w:val="single" w:color="BFBFBF" w:sz="4"/>
-              <w:bottom w:val="single" w:color="BFBFBF" w:sz="4"/>
-              <w:right w:val="single" w:color="BFBFBF" w:sz="4"/>
-            </w:tcBorders>
-            <w:tcMar>
-              <w:top w:type="dxa" w:w="60"/>
-              <w:left w:type="dxa" w:w="100"/>
-              <w:bottom w:type="dxa" w:w="60"/>
-              <w:right w:type="dxa" w:w="100"/>
-            </w:tcMar>
-          </w:tcPr>
-          <w:p>
-            <w:pPr>
-              <w:bidi/>
-              <w:spacing w:after="0"/>
-            </w:pPr>
-            <w:r>
-              <w:rPr>
-                <w:rFonts w:ascii="Arial" w:cs="Arial" w:eastAsia="Arial" w:hAnsi="Arial"/>
-                <w:sz w:val="19"/>
-                <w:szCs w:val="19"/>
-                <w:rtl/>
-              </w:rPr>
-              <w:t xml:space="preserve">בדיקות מול Salesforce עם ראשי הצוותים, תיקונים, העברה ל-IT, עלייה לאוויר</w:t>
-            </w:r>
-          </w:p>
-        </w:tc>
-        <w:tc>
-          <w:tcPr>
-            <w:tcW w:type="dxa" w:w="2980"/>
-            <w:tcBorders>
-              <w:top w:val="single" w:color="BFBFBF" w:sz="4"/>
-              <w:left w:val="single" w:color="BFBFBF" w:sz="4"/>
-              <w:bottom w:val="single" w:color="BFBFBF" w:sz="4"/>
-              <w:right w:val="single" w:color="BFBFBF" w:sz="4"/>
-            </w:tcBorders>
-            <w:tcMar>
-              <w:top w:type="dxa" w:w="60"/>
-              <w:left w:type="dxa" w:w="100"/>
-              <w:bottom w:type="dxa" w:w="60"/>
-              <w:right w:type="dxa" w:w="100"/>
-            </w:tcMar>
-          </w:tcPr>
-          <w:p>
-            <w:pPr>
-              <w:bidi/>
-              <w:spacing w:after="0"/>
-            </w:pPr>
-            <w:r>
-              <w:rPr>
-                <w:rFonts w:ascii="Arial" w:cs="Arial" w:eastAsia="Arial" w:hAnsi="Arial"/>
-                <w:sz w:val="19"/>
-                <w:szCs w:val="19"/>
-                <w:rtl/>
-              </w:rPr>
-              <w:t xml:space="preserve">ראשי צוותים, יועץ, IT</w:t>
+              <w:t xml:space="preserve">2-4</w:t>
+            </w:r>
+          </w:p>
+        </w:tc>
+        <w:tc>
+          <w:tcPr>
+            <w:tcW w:type="dxa" w:w="5848"/>
+            <w:tcBorders>
+              <w:top w:val="single" w:color="BFBFBF" w:sz="4"/>
+              <w:left w:val="single" w:color="BFBFBF" w:sz="4"/>
+              <w:bottom w:val="single" w:color="BFBFBF" w:sz="4"/>
+              <w:right w:val="single" w:color="BFBFBF" w:sz="4"/>
+            </w:tcBorders>
+            <w:tcMar>
+              <w:top w:type="dxa" w:w="60"/>
+              <w:left w:type="dxa" w:w="100"/>
+              <w:bottom w:type="dxa" w:w="60"/>
+              <w:right w:type="dxa" w:w="100"/>
+            </w:tcMar>
+          </w:tcPr>
+          <w:p>
+            <w:pPr>
+              <w:bidi/>
+              <w:spacing w:after="0"/>
+            </w:pPr>
+            <w:r>
+              <w:rPr>
+                <w:rFonts w:ascii="Arial" w:cs="Arial" w:eastAsia="Arial" w:hAnsi="Arial"/>
+                <w:sz w:val="19"/>
+                <w:szCs w:val="19"/>
+                <w:rtl/>
+              </w:rPr>
+              <w:t xml:space="preserve">בניית המסך: היועץ בונה את התשתית, את הרענון האוטומטי ואת מצב מסך הקיר. המפתח בונה את האריחים, הקישורים, אזהרת הנתונים הישנים והפריסה לטלפון</w:t>
+            </w:r>
+          </w:p>
+        </w:tc>
+        <w:tc>
+          <w:tcPr>
+            <w:tcW w:type="dxa" w:w="2840"/>
+            <w:tcBorders>
+              <w:top w:val="single" w:color="BFBFBF" w:sz="4"/>
+              <w:left w:val="single" w:color="BFBFBF" w:sz="4"/>
+              <w:bottom w:val="single" w:color="BFBFBF" w:sz="4"/>
+              <w:right w:val="single" w:color="BFBFBF" w:sz="4"/>
+            </w:tcBorders>
+            <w:tcMar>
+              <w:top w:type="dxa" w:w="60"/>
+              <w:left w:type="dxa" w:w="100"/>
+              <w:bottom w:type="dxa" w:w="60"/>
+              <w:right w:type="dxa" w:w="100"/>
+            </w:tcMar>
+          </w:tcPr>
+          <w:p>
+            <w:pPr>
+              <w:bidi/>
+              <w:spacing w:after="0"/>
+            </w:pPr>
+            <w:r>
+              <w:rPr>
+                <w:rFonts w:ascii="Arial" w:cs="Arial" w:eastAsia="Arial" w:hAnsi="Arial"/>
+                <w:sz w:val="19"/>
+                <w:szCs w:val="19"/>
+                <w:rtl/>
+              </w:rPr>
+              <w:t xml:space="preserve">יועץ, מפתח</w:t>
             </w:r>
           </w:p>
         </w:tc>
@@ -5191,71 +5221,174 @@
                 <w:szCs w:val="19"/>
                 <w:rtl/>
               </w:rPr>
-              <w:t xml:space="preserve">5-8</w:t>
-            </w:r>
-          </w:p>
-        </w:tc>
-        <w:tc>
-          <w:tcPr>
-            <w:tcW w:type="dxa" w:w="5708"/>
-            <w:tcBorders>
-              <w:top w:val="single" w:color="BFBFBF" w:sz="4"/>
-              <w:left w:val="single" w:color="BFBFBF" w:sz="4"/>
-              <w:bottom w:val="single" w:color="BFBFBF" w:sz="4"/>
-              <w:right w:val="single" w:color="BFBFBF" w:sz="4"/>
-            </w:tcBorders>
-            <w:tcMar>
-              <w:top w:type="dxa" w:w="60"/>
-              <w:left w:type="dxa" w:w="100"/>
-              <w:bottom w:type="dxa" w:w="60"/>
-              <w:right w:type="dxa" w:w="100"/>
-            </w:tcMar>
-          </w:tcPr>
-          <w:p>
-            <w:pPr>
-              <w:bidi/>
-              <w:spacing w:after="0"/>
-            </w:pPr>
-            <w:r>
-              <w:rPr>
-                <w:rFonts w:ascii="Arial" w:cs="Arial" w:eastAsia="Arial" w:hAnsi="Arial"/>
-                <w:sz w:val="19"/>
-                <w:szCs w:val="19"/>
-                <w:rtl/>
-              </w:rPr>
-              <w:t xml:space="preserve">ניסוי ומדידה</w:t>
-            </w:r>
-          </w:p>
-        </w:tc>
-        <w:tc>
-          <w:tcPr>
-            <w:tcW w:type="dxa" w:w="2980"/>
-            <w:tcBorders>
-              <w:top w:val="single" w:color="BFBFBF" w:sz="4"/>
-              <w:left w:val="single" w:color="BFBFBF" w:sz="4"/>
-              <w:bottom w:val="single" w:color="BFBFBF" w:sz="4"/>
-              <w:right w:val="single" w:color="BFBFBF" w:sz="4"/>
-            </w:tcBorders>
-            <w:tcMar>
-              <w:top w:type="dxa" w:w="60"/>
-              <w:left w:type="dxa" w:w="100"/>
-              <w:bottom w:type="dxa" w:w="60"/>
-              <w:right w:type="dxa" w:w="100"/>
-            </w:tcMar>
-          </w:tcPr>
-          <w:p>
-            <w:pPr>
-              <w:bidi/>
-              <w:spacing w:after="0"/>
-            </w:pPr>
-            <w:r>
-              <w:rPr>
-                <w:rFonts w:ascii="Arial" w:cs="Arial" w:eastAsia="Arial" w:hAnsi="Arial"/>
-                <w:sz w:val="19"/>
-                <w:szCs w:val="19"/>
-                <w:rtl/>
-              </w:rPr>
-              <w:t xml:space="preserve">מנהל התמיכה</w:t>
+              <w:t xml:space="preserve">5</w:t>
+            </w:r>
+          </w:p>
+        </w:tc>
+        <w:tc>
+          <w:tcPr>
+            <w:tcW w:type="dxa" w:w="5848"/>
+            <w:tcBorders>
+              <w:top w:val="single" w:color="BFBFBF" w:sz="4"/>
+              <w:left w:val="single" w:color="BFBFBF" w:sz="4"/>
+              <w:bottom w:val="single" w:color="BFBFBF" w:sz="4"/>
+              <w:right w:val="single" w:color="BFBFBF" w:sz="4"/>
+            </w:tcBorders>
+            <w:tcMar>
+              <w:top w:type="dxa" w:w="60"/>
+              <w:left w:type="dxa" w:w="100"/>
+              <w:bottom w:type="dxa" w:w="60"/>
+              <w:right w:type="dxa" w:w="100"/>
+            </w:tcMar>
+          </w:tcPr>
+          <w:p>
+            <w:pPr>
+              <w:bidi/>
+              <w:spacing w:after="0"/>
+            </w:pPr>
+            <w:r>
+              <w:rPr>
+                <w:rFonts w:ascii="Arial" w:cs="Arial" w:eastAsia="Arial" w:hAnsi="Arial"/>
+                <w:sz w:val="19"/>
+                <w:szCs w:val="19"/>
+                <w:rtl/>
+              </w:rPr>
+              <w:t xml:space="preserve">בדיקות מול Salesforce עם ראשי הצוותים, תיקונים, העברת ידע, עלייה לאוויר</w:t>
+            </w:r>
+          </w:p>
+        </w:tc>
+        <w:tc>
+          <w:tcPr>
+            <w:tcW w:type="dxa" w:w="2840"/>
+            <w:tcBorders>
+              <w:top w:val="single" w:color="BFBFBF" w:sz="4"/>
+              <w:left w:val="single" w:color="BFBFBF" w:sz="4"/>
+              <w:bottom w:val="single" w:color="BFBFBF" w:sz="4"/>
+              <w:right w:val="single" w:color="BFBFBF" w:sz="4"/>
+            </w:tcBorders>
+            <w:tcMar>
+              <w:top w:type="dxa" w:w="60"/>
+              <w:left w:type="dxa" w:w="100"/>
+              <w:bottom w:type="dxa" w:w="60"/>
+              <w:right w:type="dxa" w:w="100"/>
+            </w:tcMar>
+          </w:tcPr>
+          <w:p>
+            <w:pPr>
+              <w:bidi/>
+              <w:spacing w:after="0"/>
+            </w:pPr>
+            <w:r>
+              <w:rPr>
+                <w:rFonts w:ascii="Arial" w:cs="Arial" w:eastAsia="Arial" w:hAnsi="Arial"/>
+                <w:sz w:val="19"/>
+                <w:szCs w:val="19"/>
+                <w:rtl/>
+              </w:rPr>
+              <w:t xml:space="preserve">יועץ, מפתח, ראשי צוותים, IT</w:t>
+            </w:r>
+          </w:p>
+        </w:tc>
+      </w:tr>
+      <w:tr>
+        <w:trPr>
+          <w:tblHeader w:val="false"/>
+        </w:trPr>
+        <w:tc>
+          <w:tcPr>
+            <w:tcW w:type="dxa" w:w="950"/>
+            <w:tcBorders>
+              <w:top w:val="single" w:color="BFBFBF" w:sz="4"/>
+              <w:left w:val="single" w:color="BFBFBF" w:sz="4"/>
+              <w:bottom w:val="single" w:color="BFBFBF" w:sz="4"/>
+              <w:right w:val="single" w:color="BFBFBF" w:sz="4"/>
+            </w:tcBorders>
+            <w:tcMar>
+              <w:top w:type="dxa" w:w="60"/>
+              <w:left w:type="dxa" w:w="100"/>
+              <w:bottom w:type="dxa" w:w="60"/>
+              <w:right w:type="dxa" w:w="100"/>
+            </w:tcMar>
+          </w:tcPr>
+          <w:p>
+            <w:pPr>
+              <w:bidi/>
+              <w:spacing w:after="0"/>
+            </w:pPr>
+            <w:r>
+              <w:rPr>
+                <w:rFonts w:ascii="Arial" w:cs="Arial" w:eastAsia="Arial" w:hAnsi="Arial"/>
+                <w:b/>
+                <w:bCs/>
+                <w:sz w:val="19"/>
+                <w:szCs w:val="19"/>
+                <w:rtl/>
+              </w:rPr>
+              <w:t xml:space="preserve">6-9</w:t>
+            </w:r>
+          </w:p>
+        </w:tc>
+        <w:tc>
+          <w:tcPr>
+            <w:tcW w:type="dxa" w:w="5848"/>
+            <w:tcBorders>
+              <w:top w:val="single" w:color="BFBFBF" w:sz="4"/>
+              <w:left w:val="single" w:color="BFBFBF" w:sz="4"/>
+              <w:bottom w:val="single" w:color="BFBFBF" w:sz="4"/>
+              <w:right w:val="single" w:color="BFBFBF" w:sz="4"/>
+            </w:tcBorders>
+            <w:tcMar>
+              <w:top w:type="dxa" w:w="60"/>
+              <w:left w:type="dxa" w:w="100"/>
+              <w:bottom w:type="dxa" w:w="60"/>
+              <w:right w:type="dxa" w:w="100"/>
+            </w:tcMar>
+          </w:tcPr>
+          <w:p>
+            <w:pPr>
+              <w:bidi/>
+              <w:spacing w:after="0"/>
+            </w:pPr>
+            <w:r>
+              <w:rPr>
+                <w:rFonts w:ascii="Arial" w:cs="Arial" w:eastAsia="Arial" w:hAnsi="Arial"/>
+                <w:sz w:val="19"/>
+                <w:szCs w:val="19"/>
+                <w:rtl/>
+              </w:rPr>
+              <w:t xml:space="preserve">ניסוי ומדידה. המפתח מתחזק</w:t>
+            </w:r>
+          </w:p>
+        </w:tc>
+        <w:tc>
+          <w:tcPr>
+            <w:tcW w:type="dxa" w:w="2840"/>
+            <w:tcBorders>
+              <w:top w:val="single" w:color="BFBFBF" w:sz="4"/>
+              <w:left w:val="single" w:color="BFBFBF" w:sz="4"/>
+              <w:bottom w:val="single" w:color="BFBFBF" w:sz="4"/>
+              <w:right w:val="single" w:color="BFBFBF" w:sz="4"/>
+            </w:tcBorders>
+            <w:tcMar>
+              <w:top w:type="dxa" w:w="60"/>
+              <w:left w:type="dxa" w:w="100"/>
+              <w:bottom w:type="dxa" w:w="60"/>
+              <w:right w:type="dxa" w:w="100"/>
+            </w:tcMar>
+          </w:tcPr>
+          <w:p>
+            <w:pPr>
+              <w:bidi/>
+              <w:spacing w:after="0"/>
+            </w:pPr>
+            <w:r>
+              <w:rPr>
+                <w:rFonts w:ascii="Arial" w:cs="Arial" w:eastAsia="Arial" w:hAnsi="Arial"/>
+                <w:sz w:val="19"/>
+                <w:szCs w:val="19"/>
+                <w:rtl/>
+              </w:rPr>
+              <w:t xml:space="preserve">מנהל התמיכה, מפתח</w:t>
             </w:r>
           </w:p>
         </w:tc>
@@ -5440,7 +5573,7 @@
                 <w:szCs w:val="19"/>
                 <w:rtl/>
               </w:rPr>
-              <w:t xml:space="preserve">יועץ Spotfire: מסך אחד, רענון אוטומטי, קישורים, בדיקות והעברה ל-IT</w:t>
+              <w:t xml:space="preserve">יועץ Spotfire: בנייה בזוג עם המפתח, רענון אוטומטי, מסך קיר, תיעוד והעברת ידע</w:t>
             </w:r>
           </w:p>
         </w:tc>
@@ -5472,7 +5605,7 @@
                 <w:szCs w:val="19"/>
                 <w:rtl/>
               </w:rPr>
-              <w:t xml:space="preserve">כ-6-10 ימי עבודה</w:t>
+              <w:t xml:space="preserve">כ-10-14 ימי עבודה, ועוד בנק של 3-5 ימים לליווי בגל השני</w:t>
             </w:r>
           </w:p>
         </w:tc>
@@ -5541,7 +5674,7 @@
                 <w:szCs w:val="19"/>
                 <w:rtl/>
               </w:rPr>
-              <w:t xml:space="preserve">רישיונות Spotfire Cloud</w:t>
+              <w:t xml:space="preserve">מפתח פנימי</w:t>
             </w:r>
           </w:p>
         </w:tc>
@@ -5573,7 +5706,7 @@
                 <w:szCs w:val="19"/>
                 <w:rtl/>
               </w:rPr>
-              <w:t xml:space="preserve">מנהל, 7 ראשי צוותים, IT, ומסך אחד</w:t>
+              <w:t xml:space="preserve">קורס של 2-3 ימים, ועוד 5 שבועות במשרה מלאה</w:t>
             </w:r>
           </w:p>
         </w:tc>
@@ -5605,7 +5738,7 @@
                 <w:szCs w:val="19"/>
                 <w:rtl/>
               </w:rPr>
-              <w:t xml:space="preserve">לפי מחירון הספק (מסך הקיר: מודל רישוי לבדיקה)</w:t>
+              <w:t xml:space="preserve">זמן פנימי</w:t>
             </w:r>
           </w:p>
         </w:tc>
@@ -5642,7 +5775,7 @@
                 <w:szCs w:val="19"/>
                 <w:rtl/>
               </w:rPr>
-              <w:t xml:space="preserve">DBA</w:t>
+              <w:t xml:space="preserve">רישיונות Spotfire Cloud</w:t>
             </w:r>
           </w:p>
         </w:tc>
@@ -5674,7 +5807,7 @@
                 <w:szCs w:val="19"/>
                 <w:rtl/>
               </w:rPr>
-              <w:t xml:space="preserve">כ-2-4 ימי עבודה (views בלבד; אין צורך בטעינה נוספת, כי ה-DW מתעדכן בזמן אמת)</w:t>
+              <w:t xml:space="preserve">מנהל, 7 ראשי צוותים, IT, רישיון author למפתח, ומסך אחד</w:t>
             </w:r>
           </w:p>
         </w:tc>
@@ -5706,7 +5839,7 @@
                 <w:szCs w:val="19"/>
                 <w:rtl/>
               </w:rPr>
-              <w:t xml:space="preserve">זמן פנימי</w:t>
+              <w:t xml:space="preserve">לפי מחירון הספק (מסך הקיר: מודל רישוי לבדיקה)</w:t>
             </w:r>
           </w:p>
         </w:tc>
@@ -5743,7 +5876,7 @@
                 <w:szCs w:val="19"/>
                 <w:rtl/>
               </w:rPr>
-              <w:t xml:space="preserve">Salesforce Admin</w:t>
+              <w:t xml:space="preserve">DBA</w:t>
             </w:r>
           </w:p>
         </w:tc>
@@ -5775,7 +5908,7 @@
                 <w:szCs w:val="19"/>
                 <w:rtl/>
               </w:rPr>
-              <w:t xml:space="preserve">כ-1-2 ימי עבודה (גישה ושדות)</w:t>
+              <w:t xml:space="preserve">כ-2-4 ימי עבודה (views בלבד; אין צורך בטעינה נוספת, כי ה-DW מתעדכן בזמן אמת)</w:t>
             </w:r>
           </w:p>
         </w:tc>
@@ -5844,6 +5977,107 @@
                 <w:szCs w:val="19"/>
                 <w:rtl/>
               </w:rPr>
+              <w:t xml:space="preserve">Salesforce Admin</w:t>
+            </w:r>
+          </w:p>
+        </w:tc>
+        <w:tc>
+          <w:tcPr>
+            <w:tcW w:type="dxa" w:w="3504"/>
+            <w:tcBorders>
+              <w:top w:val="single" w:color="BFBFBF" w:sz="4"/>
+              <w:left w:val="single" w:color="BFBFBF" w:sz="4"/>
+              <w:bottom w:val="single" w:color="BFBFBF" w:sz="4"/>
+              <w:right w:val="single" w:color="BFBFBF" w:sz="4"/>
+            </w:tcBorders>
+            <w:tcMar>
+              <w:top w:type="dxa" w:w="60"/>
+              <w:left w:type="dxa" w:w="100"/>
+              <w:bottom w:type="dxa" w:w="60"/>
+              <w:right w:type="dxa" w:w="100"/>
+            </w:tcMar>
+          </w:tcPr>
+          <w:p>
+            <w:pPr>
+              <w:bidi/>
+              <w:spacing w:after="0"/>
+            </w:pPr>
+            <w:r>
+              <w:rPr>
+                <w:rFonts w:ascii="Arial" w:cs="Arial" w:eastAsia="Arial" w:hAnsi="Arial"/>
+                <w:sz w:val="19"/>
+                <w:szCs w:val="19"/>
+                <w:rtl/>
+              </w:rPr>
+              <w:t xml:space="preserve">כ-1-2 ימי עבודה (גישה ושדות)</w:t>
+            </w:r>
+          </w:p>
+        </w:tc>
+        <w:tc>
+          <w:tcPr>
+            <w:tcW w:type="dxa" w:w="2628"/>
+            <w:tcBorders>
+              <w:top w:val="single" w:color="BFBFBF" w:sz="4"/>
+              <w:left w:val="single" w:color="BFBFBF" w:sz="4"/>
+              <w:bottom w:val="single" w:color="BFBFBF" w:sz="4"/>
+              <w:right w:val="single" w:color="BFBFBF" w:sz="4"/>
+            </w:tcBorders>
+            <w:tcMar>
+              <w:top w:type="dxa" w:w="60"/>
+              <w:left w:type="dxa" w:w="100"/>
+              <w:bottom w:type="dxa" w:w="60"/>
+              <w:right w:type="dxa" w:w="100"/>
+            </w:tcMar>
+          </w:tcPr>
+          <w:p>
+            <w:pPr>
+              <w:bidi/>
+              <w:spacing w:after="0"/>
+            </w:pPr>
+            <w:r>
+              <w:rPr>
+                <w:rFonts w:ascii="Arial" w:cs="Arial" w:eastAsia="Arial" w:hAnsi="Arial"/>
+                <w:sz w:val="19"/>
+                <w:szCs w:val="19"/>
+                <w:rtl/>
+              </w:rPr>
+              <w:t xml:space="preserve">זמן פנימי</w:t>
+            </w:r>
+          </w:p>
+        </w:tc>
+      </w:tr>
+      <w:tr>
+        <w:trPr>
+          <w:tblHeader w:val="false"/>
+        </w:trPr>
+        <w:tc>
+          <w:tcPr>
+            <w:tcW w:type="dxa" w:w="3506"/>
+            <w:tcBorders>
+              <w:top w:val="single" w:color="BFBFBF" w:sz="4"/>
+              <w:left w:val="single" w:color="BFBFBF" w:sz="4"/>
+              <w:bottom w:val="single" w:color="BFBFBF" w:sz="4"/>
+              <w:right w:val="single" w:color="BFBFBF" w:sz="4"/>
+            </w:tcBorders>
+            <w:tcMar>
+              <w:top w:type="dxa" w:w="60"/>
+              <w:left w:type="dxa" w:w="100"/>
+              <w:bottom w:type="dxa" w:w="60"/>
+              <w:right w:type="dxa" w:w="100"/>
+            </w:tcMar>
+          </w:tcPr>
+          <w:p>
+            <w:pPr>
+              <w:bidi/>
+              <w:spacing w:after="0"/>
+            </w:pPr>
+            <w:r>
+              <w:rPr>
+                <w:rFonts w:ascii="Arial" w:cs="Arial" w:eastAsia="Arial" w:hAnsi="Arial"/>
+                <w:sz w:val="19"/>
+                <w:szCs w:val="19"/>
+                <w:rtl/>
+              </w:rPr>
               <w:t xml:space="preserve">IT</w:t>
             </w:r>
           </w:p>
@@ -5877,6 +6111,107 @@
                 <w:rtl/>
               </w:rPr>
               <w:t xml:space="preserve">כ-2 ימי עבודה</w:t>
+            </w:r>
+          </w:p>
+        </w:tc>
+        <w:tc>
+          <w:tcPr>
+            <w:tcW w:type="dxa" w:w="2628"/>
+            <w:tcBorders>
+              <w:top w:val="single" w:color="BFBFBF" w:sz="4"/>
+              <w:left w:val="single" w:color="BFBFBF" w:sz="4"/>
+              <w:bottom w:val="single" w:color="BFBFBF" w:sz="4"/>
+              <w:right w:val="single" w:color="BFBFBF" w:sz="4"/>
+            </w:tcBorders>
+            <w:tcMar>
+              <w:top w:type="dxa" w:w="60"/>
+              <w:left w:type="dxa" w:w="100"/>
+              <w:bottom w:type="dxa" w:w="60"/>
+              <w:right w:type="dxa" w:w="100"/>
+            </w:tcMar>
+          </w:tcPr>
+          <w:p>
+            <w:pPr>
+              <w:bidi/>
+              <w:spacing w:after="0"/>
+            </w:pPr>
+            <w:r>
+              <w:rPr>
+                <w:rFonts w:ascii="Arial" w:cs="Arial" w:eastAsia="Arial" w:hAnsi="Arial"/>
+                <w:sz w:val="19"/>
+                <w:szCs w:val="19"/>
+                <w:rtl/>
+              </w:rPr>
+              <w:t xml:space="preserve">זמן פנימי</w:t>
+            </w:r>
+          </w:p>
+        </w:tc>
+      </w:tr>
+      <w:tr>
+        <w:trPr>
+          <w:tblHeader w:val="false"/>
+        </w:trPr>
+        <w:tc>
+          <w:tcPr>
+            <w:tcW w:type="dxa" w:w="3506"/>
+            <w:tcBorders>
+              <w:top w:val="single" w:color="BFBFBF" w:sz="4"/>
+              <w:left w:val="single" w:color="BFBFBF" w:sz="4"/>
+              <w:bottom w:val="single" w:color="BFBFBF" w:sz="4"/>
+              <w:right w:val="single" w:color="BFBFBF" w:sz="4"/>
+            </w:tcBorders>
+            <w:tcMar>
+              <w:top w:type="dxa" w:w="60"/>
+              <w:left w:type="dxa" w:w="100"/>
+              <w:bottom w:type="dxa" w:w="60"/>
+              <w:right w:type="dxa" w:w="100"/>
+            </w:tcMar>
+          </w:tcPr>
+          <w:p>
+            <w:pPr>
+              <w:bidi/>
+              <w:spacing w:after="0"/>
+            </w:pPr>
+            <w:r>
+              <w:rPr>
+                <w:rFonts w:ascii="Arial" w:cs="Arial" w:eastAsia="Arial" w:hAnsi="Arial"/>
+                <w:sz w:val="19"/>
+                <w:szCs w:val="19"/>
+                <w:rtl/>
+              </w:rPr>
+              <w:t xml:space="preserve">תחזוקה אחרי העלייה</w:t>
+            </w:r>
+          </w:p>
+        </w:tc>
+        <w:tc>
+          <w:tcPr>
+            <w:tcW w:type="dxa" w:w="3504"/>
+            <w:tcBorders>
+              <w:top w:val="single" w:color="BFBFBF" w:sz="4"/>
+              <w:left w:val="single" w:color="BFBFBF" w:sz="4"/>
+              <w:bottom w:val="single" w:color="BFBFBF" w:sz="4"/>
+              <w:right w:val="single" w:color="BFBFBF" w:sz="4"/>
+            </w:tcBorders>
+            <w:tcMar>
+              <w:top w:type="dxa" w:w="60"/>
+              <w:left w:type="dxa" w:w="100"/>
+              <w:bottom w:type="dxa" w:w="60"/>
+              <w:right w:type="dxa" w:w="100"/>
+            </w:tcMar>
+          </w:tcPr>
+          <w:p>
+            <w:pPr>
+              <w:bidi/>
+              <w:spacing w:after="0"/>
+            </w:pPr>
+            <w:r>
+              <w:rPr>
+                <w:rFonts w:ascii="Arial" w:cs="Arial" w:eastAsia="Arial" w:hAnsi="Arial"/>
+                <w:sz w:val="19"/>
+                <w:szCs w:val="19"/>
+                <w:rtl/>
+              </w:rPr>
+              <w:t xml:space="preserve">כ-0.2 משרת מפתח וכ-0.1 משרת DBA</w:t>
             </w:r>
           </w:p>
         </w:tc>

</xml_diff>

<commit_message>
Drop the in-house alternative; Spotfire built by an external consultant
Removes the in-house development document. The short MVP (v2.2) goes
back to the standard model: an external Spotfire consultant builds the
live screen in four weeks and IT maintains it after launch. Keeps the
week-1 automatic refresh check and the Action mods note, and adds the
handover terms the consultant contract needs (ownership in the
company's library and Git, metric logic in DW views, lowest
customization layer, maintenance doc and post-upgrade checklist,
recorded handover, data access agreement).

Co-Authored-By: Claude Opus 5.5 <noreply@anthropic.com>
Claude-Session: https://claude.ai/code/session_01YcEMp91cmPuH2YbvGBFx73
</commit_message>
<xml_diff>
--- a/docs/MVP-Short.docx
+++ b/docs/MVP-Short.docx
@@ -100,7 +100,7 @@
                 <w:szCs w:val="19"/>
                 <w:rtl/>
               </w:rPr>
-              <w:t xml:space="preserve">2.1 (היקף מצומצם; יועץ ומפתח פנימי)</w:t>
+              <w:t xml:space="preserve">2.2 (היקף מצומצם; יועץ חיצוני, ו-IT מתחזק)</w:t>
             </w:r>
           </w:p>
         </w:tc>
@@ -172,7 +172,7 @@
                 <w:szCs w:val="19"/>
                 <w:rtl/>
               </w:rPr>
-              <w:t xml:space="preserve">2026-10-12</w:t>
+              <w:t xml:space="preserve">2026-10-19</w:t>
             </w:r>
           </w:p>
         </w:tc>
@@ -4613,7 +4613,7 @@
           <w:rFonts w:ascii="Arial" w:cs="Arial" w:eastAsia="Arial" w:hAnsi="Arial"/>
           <w:rtl/>
         </w:rPr>
-        <w:t xml:space="preserve">5.1 לוח זמנים: 5 שבועות עד העלייה לאוויר, ועוד 4 שבועות ניסוי</w:t>
+        <w:t xml:space="preserve">5.1 לוח זמנים: 4 שבועות עד העלייה לאוויר, ועוד 4 שבועות ניסוי</w:t>
       </w:r>
     </w:p>
     <w:p>
@@ -4636,14 +4636,14 @@
           <w:bCs/>
           <w:rtl/>
         </w:rPr>
-        <w:t xml:space="preserve">יועץ Spotfire חיצוני, ומפתח פנימי שעובד איתו צמוד ומקבל לידיו את המערכת.</w:t>
+        <w:t xml:space="preserve">יועץ Spotfire חיצוני.</w:t>
       </w:r>
       <w:r>
         <w:rPr>
           <w:rFonts w:ascii="Arial" w:cs="Arial" w:eastAsia="Arial" w:hAnsi="Arial"/>
           <w:rtl/>
         </w:rPr>
-        <w:t xml:space="preserve"> הפירוט המלא, כולל מודל העברת הידע, נמצא במסמך MVP-InHouse.</w:t>
+        <w:t xml:space="preserve"> אחרי העלייה לאוויר, IT מתחזק.</w:t>
       </w:r>
     </w:p>
     <w:tbl>
@@ -4662,8 +4662,8 @@
       </w:tblPr>
       <w:tblGrid>
         <w:gridCol w:w="950"/>
-        <w:gridCol w:w="5848"/>
-        <w:gridCol w:w="2840"/>
+        <w:gridCol w:w="6306"/>
+        <w:gridCol w:w="2382"/>
       </w:tblGrid>
       <w:tr>
         <w:trPr>
@@ -4706,7 +4706,7 @@
         </w:tc>
         <w:tc>
           <w:tcPr>
-            <w:tcW w:type="dxa" w:w="5848"/>
+            <w:tcW w:type="dxa" w:w="6306"/>
             <w:tcBorders>
               <w:top w:val="single" w:color="BFBFBF" w:sz="4"/>
               <w:left w:val="single" w:color="BFBFBF" w:sz="4"/>
@@ -4741,7 +4741,7 @@
         </w:tc>
         <w:tc>
           <w:tcPr>
-            <w:tcW w:type="dxa" w:w="2840"/>
+            <w:tcW w:type="dxa" w:w="2382"/>
             <w:tcBorders>
               <w:top w:val="single" w:color="BFBFBF" w:sz="4"/>
               <w:left w:val="single" w:color="BFBFBF" w:sz="4"/>
@@ -4815,65 +4815,65 @@
         </w:tc>
         <w:tc>
           <w:tcPr>
-            <w:tcW w:type="dxa" w:w="5848"/>
-            <w:tcBorders>
-              <w:top w:val="single" w:color="BFBFBF" w:sz="4"/>
-              <w:left w:val="single" w:color="BFBFBF" w:sz="4"/>
-              <w:bottom w:val="single" w:color="BFBFBF" w:sz="4"/>
-              <w:right w:val="single" w:color="BFBFBF" w:sz="4"/>
-            </w:tcBorders>
-            <w:tcMar>
-              <w:top w:type="dxa" w:w="60"/>
-              <w:left w:type="dxa" w:w="100"/>
-              <w:bottom w:type="dxa" w:w="60"/>
-              <w:right w:type="dxa" w:w="100"/>
-            </w:tcMar>
-          </w:tcPr>
-          <w:p>
-            <w:pPr>
-              <w:bidi/>
-              <w:spacing w:after="0"/>
-            </w:pPr>
-            <w:r>
-              <w:rPr>
-                <w:rFonts w:ascii="Arial" w:cs="Arial" w:eastAsia="Arial" w:hAnsi="Arial"/>
-                <w:sz w:val="19"/>
-                <w:szCs w:val="19"/>
-                <w:rtl/>
-              </w:rPr>
-              <w:t xml:space="preserve">קורס Spotfire בסיסי למפתח (כ-2-3 ימים). הזמנת עבודה ליועץ</w:t>
-            </w:r>
-          </w:p>
-        </w:tc>
-        <w:tc>
-          <w:tcPr>
-            <w:tcW w:type="dxa" w:w="2840"/>
-            <w:tcBorders>
-              <w:top w:val="single" w:color="BFBFBF" w:sz="4"/>
-              <w:left w:val="single" w:color="BFBFBF" w:sz="4"/>
-              <w:bottom w:val="single" w:color="BFBFBF" w:sz="4"/>
-              <w:right w:val="single" w:color="BFBFBF" w:sz="4"/>
-            </w:tcBorders>
-            <w:tcMar>
-              <w:top w:type="dxa" w:w="60"/>
-              <w:left w:type="dxa" w:w="100"/>
-              <w:bottom w:type="dxa" w:w="60"/>
-              <w:right w:type="dxa" w:w="100"/>
-            </w:tcMar>
-          </w:tcPr>
-          <w:p>
-            <w:pPr>
-              <w:bidi/>
-              <w:spacing w:after="0"/>
-            </w:pPr>
-            <w:r>
-              <w:rPr>
-                <w:rFonts w:ascii="Arial" w:cs="Arial" w:eastAsia="Arial" w:hAnsi="Arial"/>
-                <w:sz w:val="19"/>
-                <w:szCs w:val="19"/>
-                <w:rtl/>
-              </w:rPr>
-              <w:t xml:space="preserve">מפתח, מנהל התמיכה</w:t>
+            <w:tcW w:type="dxa" w:w="6306"/>
+            <w:tcBorders>
+              <w:top w:val="single" w:color="BFBFBF" w:sz="4"/>
+              <w:left w:val="single" w:color="BFBFBF" w:sz="4"/>
+              <w:bottom w:val="single" w:color="BFBFBF" w:sz="4"/>
+              <w:right w:val="single" w:color="BFBFBF" w:sz="4"/>
+            </w:tcBorders>
+            <w:tcMar>
+              <w:top w:type="dxa" w:w="60"/>
+              <w:left w:type="dxa" w:w="100"/>
+              <w:bottom w:type="dxa" w:w="60"/>
+              <w:right w:type="dxa" w:w="100"/>
+            </w:tcMar>
+          </w:tcPr>
+          <w:p>
+            <w:pPr>
+              <w:bidi/>
+              <w:spacing w:after="0"/>
+            </w:pPr>
+            <w:r>
+              <w:rPr>
+                <w:rFonts w:ascii="Arial" w:cs="Arial" w:eastAsia="Arial" w:hAnsi="Arial"/>
+                <w:sz w:val="19"/>
+                <w:szCs w:val="19"/>
+                <w:rtl/>
+              </w:rPr>
+              <w:t xml:space="preserve">הזמנת עבודה ליועץ, כולל דרישות ההעברה (5.3) והסכם גישה לנתונים</w:t>
+            </w:r>
+          </w:p>
+        </w:tc>
+        <w:tc>
+          <w:tcPr>
+            <w:tcW w:type="dxa" w:w="2382"/>
+            <w:tcBorders>
+              <w:top w:val="single" w:color="BFBFBF" w:sz="4"/>
+              <w:left w:val="single" w:color="BFBFBF" w:sz="4"/>
+              <w:bottom w:val="single" w:color="BFBFBF" w:sz="4"/>
+              <w:right w:val="single" w:color="BFBFBF" w:sz="4"/>
+            </w:tcBorders>
+            <w:tcMar>
+              <w:top w:type="dxa" w:w="60"/>
+              <w:left w:type="dxa" w:w="100"/>
+              <w:bottom w:type="dxa" w:w="60"/>
+              <w:right w:type="dxa" w:w="100"/>
+            </w:tcMar>
+          </w:tcPr>
+          <w:p>
+            <w:pPr>
+              <w:bidi/>
+              <w:spacing w:after="0"/>
+            </w:pPr>
+            <w:r>
+              <w:rPr>
+                <w:rFonts w:ascii="Arial" w:cs="Arial" w:eastAsia="Arial" w:hAnsi="Arial"/>
+                <w:sz w:val="19"/>
+                <w:szCs w:val="19"/>
+                <w:rtl/>
+              </w:rPr>
+              <w:t xml:space="preserve">מנהל התמיכה</w:t>
             </w:r>
           </w:p>
         </w:tc>
@@ -4918,7 +4918,7 @@
         </w:tc>
         <w:tc>
           <w:tcPr>
-            <w:tcW w:type="dxa" w:w="5848"/>
+            <w:tcW w:type="dxa" w:w="6306"/>
             <w:tcBorders>
               <w:top w:val="single" w:color="BFBFBF" w:sz="4"/>
               <w:left w:val="single" w:color="BFBFBF" w:sz="4"/>
@@ -4950,33 +4950,33 @@
         </w:tc>
         <w:tc>
           <w:tcPr>
-            <w:tcW w:type="dxa" w:w="2840"/>
-            <w:tcBorders>
-              <w:top w:val="single" w:color="BFBFBF" w:sz="4"/>
-              <w:left w:val="single" w:color="BFBFBF" w:sz="4"/>
-              <w:bottom w:val="single" w:color="BFBFBF" w:sz="4"/>
-              <w:right w:val="single" w:color="BFBFBF" w:sz="4"/>
-            </w:tcBorders>
-            <w:tcMar>
-              <w:top w:type="dxa" w:w="60"/>
-              <w:left w:type="dxa" w:w="100"/>
-              <w:bottom w:type="dxa" w:w="60"/>
-              <w:right w:type="dxa" w:w="100"/>
-            </w:tcMar>
-          </w:tcPr>
-          <w:p>
-            <w:pPr>
-              <w:bidi/>
-              <w:spacing w:after="0"/>
-            </w:pPr>
-            <w:r>
-              <w:rPr>
-                <w:rFonts w:ascii="Arial" w:cs="Arial" w:eastAsia="Arial" w:hAnsi="Arial"/>
-                <w:sz w:val="19"/>
-                <w:szCs w:val="19"/>
-                <w:rtl/>
-              </w:rPr>
-              <w:t xml:space="preserve">יועץ, מפתח, DBA, מנהל התמיכה</w:t>
+            <w:tcW w:type="dxa" w:w="2382"/>
+            <w:tcBorders>
+              <w:top w:val="single" w:color="BFBFBF" w:sz="4"/>
+              <w:left w:val="single" w:color="BFBFBF" w:sz="4"/>
+              <w:bottom w:val="single" w:color="BFBFBF" w:sz="4"/>
+              <w:right w:val="single" w:color="BFBFBF" w:sz="4"/>
+            </w:tcBorders>
+            <w:tcMar>
+              <w:top w:type="dxa" w:w="60"/>
+              <w:left w:type="dxa" w:w="100"/>
+              <w:bottom w:type="dxa" w:w="60"/>
+              <w:right w:type="dxa" w:w="100"/>
+            </w:tcMar>
+          </w:tcPr>
+          <w:p>
+            <w:pPr>
+              <w:bidi/>
+              <w:spacing w:after="0"/>
+            </w:pPr>
+            <w:r>
+              <w:rPr>
+                <w:rFonts w:ascii="Arial" w:cs="Arial" w:eastAsia="Arial" w:hAnsi="Arial"/>
+                <w:sz w:val="19"/>
+                <w:szCs w:val="19"/>
+                <w:rtl/>
+              </w:rPr>
+              <w:t xml:space="preserve">יועץ, DBA, מנהל התמיכה</w:t>
             </w:r>
           </w:p>
         </w:tc>
@@ -5021,7 +5021,7 @@
         </w:tc>
         <w:tc>
           <w:tcPr>
-            <w:tcW w:type="dxa" w:w="5848"/>
+            <w:tcW w:type="dxa" w:w="6306"/>
             <w:tcBorders>
               <w:top w:val="single" w:color="BFBFBF" w:sz="4"/>
               <w:left w:val="single" w:color="BFBFBF" w:sz="4"/>
@@ -5053,7 +5053,7 @@
         </w:tc>
         <w:tc>
           <w:tcPr>
-            <w:tcW w:type="dxa" w:w="2840"/>
+            <w:tcW w:type="dxa" w:w="2382"/>
             <w:tcBorders>
               <w:top w:val="single" w:color="BFBFBF" w:sz="4"/>
               <w:left w:val="single" w:color="BFBFBF" w:sz="4"/>
@@ -5118,71 +5118,71 @@
                 <w:szCs w:val="19"/>
                 <w:rtl/>
               </w:rPr>
-              <w:t xml:space="preserve">2-4</w:t>
-            </w:r>
-          </w:p>
-        </w:tc>
-        <w:tc>
-          <w:tcPr>
-            <w:tcW w:type="dxa" w:w="5848"/>
-            <w:tcBorders>
-              <w:top w:val="single" w:color="BFBFBF" w:sz="4"/>
-              <w:left w:val="single" w:color="BFBFBF" w:sz="4"/>
-              <w:bottom w:val="single" w:color="BFBFBF" w:sz="4"/>
-              <w:right w:val="single" w:color="BFBFBF" w:sz="4"/>
-            </w:tcBorders>
-            <w:tcMar>
-              <w:top w:type="dxa" w:w="60"/>
-              <w:left w:type="dxa" w:w="100"/>
-              <w:bottom w:type="dxa" w:w="60"/>
-              <w:right w:type="dxa" w:w="100"/>
-            </w:tcMar>
-          </w:tcPr>
-          <w:p>
-            <w:pPr>
-              <w:bidi/>
-              <w:spacing w:after="0"/>
-            </w:pPr>
-            <w:r>
-              <w:rPr>
-                <w:rFonts w:ascii="Arial" w:cs="Arial" w:eastAsia="Arial" w:hAnsi="Arial"/>
-                <w:sz w:val="19"/>
-                <w:szCs w:val="19"/>
-                <w:rtl/>
-              </w:rPr>
-              <w:t xml:space="preserve">בניית המסך: היועץ בונה את התשתית, את הרענון האוטומטי ואת מצב מסך הקיר. המפתח בונה את האריחים, הקישורים, אזהרת הנתונים הישנים והפריסה לטלפון</w:t>
-            </w:r>
-          </w:p>
-        </w:tc>
-        <w:tc>
-          <w:tcPr>
-            <w:tcW w:type="dxa" w:w="2840"/>
-            <w:tcBorders>
-              <w:top w:val="single" w:color="BFBFBF" w:sz="4"/>
-              <w:left w:val="single" w:color="BFBFBF" w:sz="4"/>
-              <w:bottom w:val="single" w:color="BFBFBF" w:sz="4"/>
-              <w:right w:val="single" w:color="BFBFBF" w:sz="4"/>
-            </w:tcBorders>
-            <w:tcMar>
-              <w:top w:type="dxa" w:w="60"/>
-              <w:left w:type="dxa" w:w="100"/>
-              <w:bottom w:type="dxa" w:w="60"/>
-              <w:right w:type="dxa" w:w="100"/>
-            </w:tcMar>
-          </w:tcPr>
-          <w:p>
-            <w:pPr>
-              <w:bidi/>
-              <w:spacing w:after="0"/>
-            </w:pPr>
-            <w:r>
-              <w:rPr>
-                <w:rFonts w:ascii="Arial" w:cs="Arial" w:eastAsia="Arial" w:hAnsi="Arial"/>
-                <w:sz w:val="19"/>
-                <w:szCs w:val="19"/>
-                <w:rtl/>
-              </w:rPr>
-              <w:t xml:space="preserve">יועץ, מפתח</w:t>
+              <w:t xml:space="preserve">2-3</w:t>
+            </w:r>
+          </w:p>
+        </w:tc>
+        <w:tc>
+          <w:tcPr>
+            <w:tcW w:type="dxa" w:w="6306"/>
+            <w:tcBorders>
+              <w:top w:val="single" w:color="BFBFBF" w:sz="4"/>
+              <w:left w:val="single" w:color="BFBFBF" w:sz="4"/>
+              <w:bottom w:val="single" w:color="BFBFBF" w:sz="4"/>
+              <w:right w:val="single" w:color="BFBFBF" w:sz="4"/>
+            </w:tcBorders>
+            <w:tcMar>
+              <w:top w:type="dxa" w:w="60"/>
+              <w:left w:type="dxa" w:w="100"/>
+              <w:bottom w:type="dxa" w:w="60"/>
+              <w:right w:type="dxa" w:w="100"/>
+            </w:tcMar>
+          </w:tcPr>
+          <w:p>
+            <w:pPr>
+              <w:bidi/>
+              <w:spacing w:after="0"/>
+            </w:pPr>
+            <w:r>
+              <w:rPr>
+                <w:rFonts w:ascii="Arial" w:cs="Arial" w:eastAsia="Arial" w:hAnsi="Arial"/>
+                <w:sz w:val="19"/>
+                <w:szCs w:val="19"/>
+                <w:rtl/>
+              </w:rPr>
+              <w:t xml:space="preserve">בניית המסך ב-Spotfire: טבלאות in-database, אריחים, רשימות, מסנן, קישורים ל-Salesforce, אזהרת נתונים ישנים, פריסה לטלפון</w:t>
+            </w:r>
+          </w:p>
+        </w:tc>
+        <w:tc>
+          <w:tcPr>
+            <w:tcW w:type="dxa" w:w="2382"/>
+            <w:tcBorders>
+              <w:top w:val="single" w:color="BFBFBF" w:sz="4"/>
+              <w:left w:val="single" w:color="BFBFBF" w:sz="4"/>
+              <w:bottom w:val="single" w:color="BFBFBF" w:sz="4"/>
+              <w:right w:val="single" w:color="BFBFBF" w:sz="4"/>
+            </w:tcBorders>
+            <w:tcMar>
+              <w:top w:type="dxa" w:w="60"/>
+              <w:left w:type="dxa" w:w="100"/>
+              <w:bottom w:type="dxa" w:w="60"/>
+              <w:right w:type="dxa" w:w="100"/>
+            </w:tcMar>
+          </w:tcPr>
+          <w:p>
+            <w:pPr>
+              <w:bidi/>
+              <w:spacing w:after="0"/>
+            </w:pPr>
+            <w:r>
+              <w:rPr>
+                <w:rFonts w:ascii="Arial" w:cs="Arial" w:eastAsia="Arial" w:hAnsi="Arial"/>
+                <w:sz w:val="19"/>
+                <w:szCs w:val="19"/>
+                <w:rtl/>
+              </w:rPr>
+              <w:t xml:space="preserve">יועץ</w:t>
             </w:r>
           </w:p>
         </w:tc>
@@ -5221,71 +5221,71 @@
                 <w:szCs w:val="19"/>
                 <w:rtl/>
               </w:rPr>
-              <w:t xml:space="preserve">5</w:t>
-            </w:r>
-          </w:p>
-        </w:tc>
-        <w:tc>
-          <w:tcPr>
-            <w:tcW w:type="dxa" w:w="5848"/>
-            <w:tcBorders>
-              <w:top w:val="single" w:color="BFBFBF" w:sz="4"/>
-              <w:left w:val="single" w:color="BFBFBF" w:sz="4"/>
-              <w:bottom w:val="single" w:color="BFBFBF" w:sz="4"/>
-              <w:right w:val="single" w:color="BFBFBF" w:sz="4"/>
-            </w:tcBorders>
-            <w:tcMar>
-              <w:top w:type="dxa" w:w="60"/>
-              <w:left w:type="dxa" w:w="100"/>
-              <w:bottom w:type="dxa" w:w="60"/>
-              <w:right w:type="dxa" w:w="100"/>
-            </w:tcMar>
-          </w:tcPr>
-          <w:p>
-            <w:pPr>
-              <w:bidi/>
-              <w:spacing w:after="0"/>
-            </w:pPr>
-            <w:r>
-              <w:rPr>
-                <w:rFonts w:ascii="Arial" w:cs="Arial" w:eastAsia="Arial" w:hAnsi="Arial"/>
-                <w:sz w:val="19"/>
-                <w:szCs w:val="19"/>
-                <w:rtl/>
-              </w:rPr>
-              <w:t xml:space="preserve">בדיקות מול Salesforce עם ראשי הצוותים, תיקונים, העברת ידע, עלייה לאוויר</w:t>
-            </w:r>
-          </w:p>
-        </w:tc>
-        <w:tc>
-          <w:tcPr>
-            <w:tcW w:type="dxa" w:w="2840"/>
-            <w:tcBorders>
-              <w:top w:val="single" w:color="BFBFBF" w:sz="4"/>
-              <w:left w:val="single" w:color="BFBFBF" w:sz="4"/>
-              <w:bottom w:val="single" w:color="BFBFBF" w:sz="4"/>
-              <w:right w:val="single" w:color="BFBFBF" w:sz="4"/>
-            </w:tcBorders>
-            <w:tcMar>
-              <w:top w:type="dxa" w:w="60"/>
-              <w:left w:type="dxa" w:w="100"/>
-              <w:bottom w:type="dxa" w:w="60"/>
-              <w:right w:type="dxa" w:w="100"/>
-            </w:tcMar>
-          </w:tcPr>
-          <w:p>
-            <w:pPr>
-              <w:bidi/>
-              <w:spacing w:after="0"/>
-            </w:pPr>
-            <w:r>
-              <w:rPr>
-                <w:rFonts w:ascii="Arial" w:cs="Arial" w:eastAsia="Arial" w:hAnsi="Arial"/>
-                <w:sz w:val="19"/>
-                <w:szCs w:val="19"/>
-                <w:rtl/>
-              </w:rPr>
-              <w:t xml:space="preserve">יועץ, מפתח, ראשי צוותים, IT</w:t>
+              <w:t xml:space="preserve">4</w:t>
+            </w:r>
+          </w:p>
+        </w:tc>
+        <w:tc>
+          <w:tcPr>
+            <w:tcW w:type="dxa" w:w="6306"/>
+            <w:tcBorders>
+              <w:top w:val="single" w:color="BFBFBF" w:sz="4"/>
+              <w:left w:val="single" w:color="BFBFBF" w:sz="4"/>
+              <w:bottom w:val="single" w:color="BFBFBF" w:sz="4"/>
+              <w:right w:val="single" w:color="BFBFBF" w:sz="4"/>
+            </w:tcBorders>
+            <w:tcMar>
+              <w:top w:type="dxa" w:w="60"/>
+              <w:left w:type="dxa" w:w="100"/>
+              <w:bottom w:type="dxa" w:w="60"/>
+              <w:right w:type="dxa" w:w="100"/>
+            </w:tcMar>
+          </w:tcPr>
+          <w:p>
+            <w:pPr>
+              <w:bidi/>
+              <w:spacing w:after="0"/>
+            </w:pPr>
+            <w:r>
+              <w:rPr>
+                <w:rFonts w:ascii="Arial" w:cs="Arial" w:eastAsia="Arial" w:hAnsi="Arial"/>
+                <w:sz w:val="19"/>
+                <w:szCs w:val="19"/>
+                <w:rtl/>
+              </w:rPr>
+              <w:t xml:space="preserve">רענון אוטומטי ומצב מסך קיר; בדיקות מול Salesforce עם ראשי הצוותים; תיקונים; העברה ל-IT; עלייה לאוויר</w:t>
+            </w:r>
+          </w:p>
+        </w:tc>
+        <w:tc>
+          <w:tcPr>
+            <w:tcW w:type="dxa" w:w="2382"/>
+            <w:tcBorders>
+              <w:top w:val="single" w:color="BFBFBF" w:sz="4"/>
+              <w:left w:val="single" w:color="BFBFBF" w:sz="4"/>
+              <w:bottom w:val="single" w:color="BFBFBF" w:sz="4"/>
+              <w:right w:val="single" w:color="BFBFBF" w:sz="4"/>
+            </w:tcBorders>
+            <w:tcMar>
+              <w:top w:type="dxa" w:w="60"/>
+              <w:left w:type="dxa" w:w="100"/>
+              <w:bottom w:type="dxa" w:w="60"/>
+              <w:right w:type="dxa" w:w="100"/>
+            </w:tcMar>
+          </w:tcPr>
+          <w:p>
+            <w:pPr>
+              <w:bidi/>
+              <w:spacing w:after="0"/>
+            </w:pPr>
+            <w:r>
+              <w:rPr>
+                <w:rFonts w:ascii="Arial" w:cs="Arial" w:eastAsia="Arial" w:hAnsi="Arial"/>
+                <w:sz w:val="19"/>
+                <w:szCs w:val="19"/>
+                <w:rtl/>
+              </w:rPr>
+              <w:t xml:space="preserve">יועץ, ראשי צוותים, IT</w:t>
             </w:r>
           </w:p>
         </w:tc>
@@ -5324,71 +5324,71 @@
                 <w:szCs w:val="19"/>
                 <w:rtl/>
               </w:rPr>
-              <w:t xml:space="preserve">6-9</w:t>
-            </w:r>
-          </w:p>
-        </w:tc>
-        <w:tc>
-          <w:tcPr>
-            <w:tcW w:type="dxa" w:w="5848"/>
-            <w:tcBorders>
-              <w:top w:val="single" w:color="BFBFBF" w:sz="4"/>
-              <w:left w:val="single" w:color="BFBFBF" w:sz="4"/>
-              <w:bottom w:val="single" w:color="BFBFBF" w:sz="4"/>
-              <w:right w:val="single" w:color="BFBFBF" w:sz="4"/>
-            </w:tcBorders>
-            <w:tcMar>
-              <w:top w:type="dxa" w:w="60"/>
-              <w:left w:type="dxa" w:w="100"/>
-              <w:bottom w:type="dxa" w:w="60"/>
-              <w:right w:type="dxa" w:w="100"/>
-            </w:tcMar>
-          </w:tcPr>
-          <w:p>
-            <w:pPr>
-              <w:bidi/>
-              <w:spacing w:after="0"/>
-            </w:pPr>
-            <w:r>
-              <w:rPr>
-                <w:rFonts w:ascii="Arial" w:cs="Arial" w:eastAsia="Arial" w:hAnsi="Arial"/>
-                <w:sz w:val="19"/>
-                <w:szCs w:val="19"/>
-                <w:rtl/>
-              </w:rPr>
-              <w:t xml:space="preserve">ניסוי ומדידה. המפתח מתחזק</w:t>
-            </w:r>
-          </w:p>
-        </w:tc>
-        <w:tc>
-          <w:tcPr>
-            <w:tcW w:type="dxa" w:w="2840"/>
-            <w:tcBorders>
-              <w:top w:val="single" w:color="BFBFBF" w:sz="4"/>
-              <w:left w:val="single" w:color="BFBFBF" w:sz="4"/>
-              <w:bottom w:val="single" w:color="BFBFBF" w:sz="4"/>
-              <w:right w:val="single" w:color="BFBFBF" w:sz="4"/>
-            </w:tcBorders>
-            <w:tcMar>
-              <w:top w:type="dxa" w:w="60"/>
-              <w:left w:type="dxa" w:w="100"/>
-              <w:bottom w:type="dxa" w:w="60"/>
-              <w:right w:type="dxa" w:w="100"/>
-            </w:tcMar>
-          </w:tcPr>
-          <w:p>
-            <w:pPr>
-              <w:bidi/>
-              <w:spacing w:after="0"/>
-            </w:pPr>
-            <w:r>
-              <w:rPr>
-                <w:rFonts w:ascii="Arial" w:cs="Arial" w:eastAsia="Arial" w:hAnsi="Arial"/>
-                <w:sz w:val="19"/>
-                <w:szCs w:val="19"/>
-                <w:rtl/>
-              </w:rPr>
-              <w:t xml:space="preserve">מנהל התמיכה, מפתח</w:t>
+              <w:t xml:space="preserve">5-8</w:t>
+            </w:r>
+          </w:p>
+        </w:tc>
+        <w:tc>
+          <w:tcPr>
+            <w:tcW w:type="dxa" w:w="6306"/>
+            <w:tcBorders>
+              <w:top w:val="single" w:color="BFBFBF" w:sz="4"/>
+              <w:left w:val="single" w:color="BFBFBF" w:sz="4"/>
+              <w:bottom w:val="single" w:color="BFBFBF" w:sz="4"/>
+              <w:right w:val="single" w:color="BFBFBF" w:sz="4"/>
+            </w:tcBorders>
+            <w:tcMar>
+              <w:top w:type="dxa" w:w="60"/>
+              <w:left w:type="dxa" w:w="100"/>
+              <w:bottom w:type="dxa" w:w="60"/>
+              <w:right w:type="dxa" w:w="100"/>
+            </w:tcMar>
+          </w:tcPr>
+          <w:p>
+            <w:pPr>
+              <w:bidi/>
+              <w:spacing w:after="0"/>
+            </w:pPr>
+            <w:r>
+              <w:rPr>
+                <w:rFonts w:ascii="Arial" w:cs="Arial" w:eastAsia="Arial" w:hAnsi="Arial"/>
+                <w:sz w:val="19"/>
+                <w:szCs w:val="19"/>
+                <w:rtl/>
+              </w:rPr>
+              <w:t xml:space="preserve">ניסוי ומדידה. IT מתחזק, והיועץ זמין לתיקונים</w:t>
+            </w:r>
+          </w:p>
+        </w:tc>
+        <w:tc>
+          <w:tcPr>
+            <w:tcW w:type="dxa" w:w="2382"/>
+            <w:tcBorders>
+              <w:top w:val="single" w:color="BFBFBF" w:sz="4"/>
+              <w:left w:val="single" w:color="BFBFBF" w:sz="4"/>
+              <w:bottom w:val="single" w:color="BFBFBF" w:sz="4"/>
+              <w:right w:val="single" w:color="BFBFBF" w:sz="4"/>
+            </w:tcBorders>
+            <w:tcMar>
+              <w:top w:type="dxa" w:w="60"/>
+              <w:left w:type="dxa" w:w="100"/>
+              <w:bottom w:type="dxa" w:w="60"/>
+              <w:right w:type="dxa" w:w="100"/>
+            </w:tcMar>
+          </w:tcPr>
+          <w:p>
+            <w:pPr>
+              <w:bidi/>
+              <w:spacing w:after="0"/>
+            </w:pPr>
+            <w:r>
+              <w:rPr>
+                <w:rFonts w:ascii="Arial" w:cs="Arial" w:eastAsia="Arial" w:hAnsi="Arial"/>
+                <w:sz w:val="19"/>
+                <w:szCs w:val="19"/>
+                <w:rtl/>
+              </w:rPr>
+              <w:t xml:space="preserve">מנהל התמיכה, IT</w:t>
             </w:r>
           </w:p>
         </w:tc>
@@ -5573,7 +5573,7 @@
                 <w:szCs w:val="19"/>
                 <w:rtl/>
               </w:rPr>
-              <w:t xml:space="preserve">יועץ Spotfire: בנייה בזוג עם המפתח, רענון אוטומטי, מסך קיר, תיעוד והעברת ידע</w:t>
+              <w:t xml:space="preserve">יועץ Spotfire: מסך אחד, רענון אוטומטי, מסך קיר, קישורים, בדיקות, תיעוד והעברה ל-IT</w:t>
             </w:r>
           </w:p>
         </w:tc>
@@ -5605,7 +5605,7 @@
                 <w:szCs w:val="19"/>
                 <w:rtl/>
               </w:rPr>
-              <w:t xml:space="preserve">כ-10-14 ימי עבודה, ועוד בנק של 3-5 ימים לליווי בגל השני</w:t>
+              <w:t xml:space="preserve">כ-6-10 ימי עבודה, ועוד בנק של כמה שעות לתיקונים בתקופת הניסוי</w:t>
             </w:r>
           </w:p>
         </w:tc>
@@ -5674,7 +5674,7 @@
                 <w:szCs w:val="19"/>
                 <w:rtl/>
               </w:rPr>
-              <w:t xml:space="preserve">מפתח פנימי</w:t>
+              <w:t xml:space="preserve">רישיונות Spotfire Cloud</w:t>
             </w:r>
           </w:p>
         </w:tc>
@@ -5706,7 +5706,7 @@
                 <w:szCs w:val="19"/>
                 <w:rtl/>
               </w:rPr>
-              <w:t xml:space="preserve">קורס של 2-3 ימים, ועוד 5 שבועות במשרה מלאה</w:t>
+              <w:t xml:space="preserve">מנהל, 7 ראשי צוותים, IT, ומסך אחד</w:t>
             </w:r>
           </w:p>
         </w:tc>
@@ -5738,7 +5738,7 @@
                 <w:szCs w:val="19"/>
                 <w:rtl/>
               </w:rPr>
-              <w:t xml:space="preserve">זמן פנימי</w:t>
+              <w:t xml:space="preserve">לפי מחירון הספק (מסך הקיר: מודל רישוי לבדיקה)</w:t>
             </w:r>
           </w:p>
         </w:tc>
@@ -5775,7 +5775,7 @@
                 <w:szCs w:val="19"/>
                 <w:rtl/>
               </w:rPr>
-              <w:t xml:space="preserve">רישיונות Spotfire Cloud</w:t>
+              <w:t xml:space="preserve">DBA</w:t>
             </w:r>
           </w:p>
         </w:tc>
@@ -5807,7 +5807,7 @@
                 <w:szCs w:val="19"/>
                 <w:rtl/>
               </w:rPr>
-              <w:t xml:space="preserve">מנהל, 7 ראשי צוותים, IT, רישיון author למפתח, ומסך אחד</w:t>
+              <w:t xml:space="preserve">כ-2-4 ימי עבודה (views בלבד; אין צורך בטעינה נוספת, כי ה-DW מתעדכן בזמן אמת)</w:t>
             </w:r>
           </w:p>
         </w:tc>
@@ -5839,7 +5839,7 @@
                 <w:szCs w:val="19"/>
                 <w:rtl/>
               </w:rPr>
-              <w:t xml:space="preserve">לפי מחירון הספק (מסך הקיר: מודל רישוי לבדיקה)</w:t>
+              <w:t xml:space="preserve">זמן פנימי</w:t>
             </w:r>
           </w:p>
         </w:tc>
@@ -5876,7 +5876,7 @@
                 <w:szCs w:val="19"/>
                 <w:rtl/>
               </w:rPr>
-              <w:t xml:space="preserve">DBA</w:t>
+              <w:t xml:space="preserve">Salesforce Admin</w:t>
             </w:r>
           </w:p>
         </w:tc>
@@ -5908,7 +5908,7 @@
                 <w:szCs w:val="19"/>
                 <w:rtl/>
               </w:rPr>
-              <w:t xml:space="preserve">כ-2-4 ימי עבודה (views בלבד; אין צורך בטעינה נוספת, כי ה-DW מתעדכן בזמן אמת)</w:t>
+              <w:t xml:space="preserve">כ-1-2 ימי עבודה (גישה ושדות)</w:t>
             </w:r>
           </w:p>
         </w:tc>
@@ -5977,7 +5977,7 @@
                 <w:szCs w:val="19"/>
                 <w:rtl/>
               </w:rPr>
-              <w:t xml:space="preserve">Salesforce Admin</w:t>
+              <w:t xml:space="preserve">IT</w:t>
             </w:r>
           </w:p>
         </w:tc>
@@ -6009,209 +6009,7 @@
                 <w:szCs w:val="19"/>
                 <w:rtl/>
               </w:rPr>
-              <w:t xml:space="preserve">כ-1-2 ימי עבודה (גישה ושדות)</w:t>
-            </w:r>
-          </w:p>
-        </w:tc>
-        <w:tc>
-          <w:tcPr>
-            <w:tcW w:type="dxa" w:w="2628"/>
-            <w:tcBorders>
-              <w:top w:val="single" w:color="BFBFBF" w:sz="4"/>
-              <w:left w:val="single" w:color="BFBFBF" w:sz="4"/>
-              <w:bottom w:val="single" w:color="BFBFBF" w:sz="4"/>
-              <w:right w:val="single" w:color="BFBFBF" w:sz="4"/>
-            </w:tcBorders>
-            <w:tcMar>
-              <w:top w:type="dxa" w:w="60"/>
-              <w:left w:type="dxa" w:w="100"/>
-              <w:bottom w:type="dxa" w:w="60"/>
-              <w:right w:type="dxa" w:w="100"/>
-            </w:tcMar>
-          </w:tcPr>
-          <w:p>
-            <w:pPr>
-              <w:bidi/>
-              <w:spacing w:after="0"/>
-            </w:pPr>
-            <w:r>
-              <w:rPr>
-                <w:rFonts w:ascii="Arial" w:cs="Arial" w:eastAsia="Arial" w:hAnsi="Arial"/>
-                <w:sz w:val="19"/>
-                <w:szCs w:val="19"/>
-                <w:rtl/>
-              </w:rPr>
-              <w:t xml:space="preserve">זמן פנימי</w:t>
-            </w:r>
-          </w:p>
-        </w:tc>
-      </w:tr>
-      <w:tr>
-        <w:trPr>
-          <w:tblHeader w:val="false"/>
-        </w:trPr>
-        <w:tc>
-          <w:tcPr>
-            <w:tcW w:type="dxa" w:w="3506"/>
-            <w:tcBorders>
-              <w:top w:val="single" w:color="BFBFBF" w:sz="4"/>
-              <w:left w:val="single" w:color="BFBFBF" w:sz="4"/>
-              <w:bottom w:val="single" w:color="BFBFBF" w:sz="4"/>
-              <w:right w:val="single" w:color="BFBFBF" w:sz="4"/>
-            </w:tcBorders>
-            <w:tcMar>
-              <w:top w:type="dxa" w:w="60"/>
-              <w:left w:type="dxa" w:w="100"/>
-              <w:bottom w:type="dxa" w:w="60"/>
-              <w:right w:type="dxa" w:w="100"/>
-            </w:tcMar>
-          </w:tcPr>
-          <w:p>
-            <w:pPr>
-              <w:bidi/>
-              <w:spacing w:after="0"/>
-            </w:pPr>
-            <w:r>
-              <w:rPr>
-                <w:rFonts w:ascii="Arial" w:cs="Arial" w:eastAsia="Arial" w:hAnsi="Arial"/>
-                <w:sz w:val="19"/>
-                <w:szCs w:val="19"/>
-                <w:rtl/>
-              </w:rPr>
-              <w:t xml:space="preserve">IT</w:t>
-            </w:r>
-          </w:p>
-        </w:tc>
-        <w:tc>
-          <w:tcPr>
-            <w:tcW w:type="dxa" w:w="3504"/>
-            <w:tcBorders>
-              <w:top w:val="single" w:color="BFBFBF" w:sz="4"/>
-              <w:left w:val="single" w:color="BFBFBF" w:sz="4"/>
-              <w:bottom w:val="single" w:color="BFBFBF" w:sz="4"/>
-              <w:right w:val="single" w:color="BFBFBF" w:sz="4"/>
-            </w:tcBorders>
-            <w:tcMar>
-              <w:top w:type="dxa" w:w="60"/>
-              <w:left w:type="dxa" w:w="100"/>
-              <w:bottom w:type="dxa" w:w="60"/>
-              <w:right w:type="dxa" w:w="100"/>
-            </w:tcMar>
-          </w:tcPr>
-          <w:p>
-            <w:pPr>
-              <w:bidi/>
-              <w:spacing w:after="0"/>
-            </w:pPr>
-            <w:r>
-              <w:rPr>
-                <w:rFonts w:ascii="Arial" w:cs="Arial" w:eastAsia="Arial" w:hAnsi="Arial"/>
-                <w:sz w:val="19"/>
-                <w:szCs w:val="19"/>
-                <w:rtl/>
-              </w:rPr>
-              <w:t xml:space="preserve">כ-2 ימי עבודה</w:t>
-            </w:r>
-          </w:p>
-        </w:tc>
-        <w:tc>
-          <w:tcPr>
-            <w:tcW w:type="dxa" w:w="2628"/>
-            <w:tcBorders>
-              <w:top w:val="single" w:color="BFBFBF" w:sz="4"/>
-              <w:left w:val="single" w:color="BFBFBF" w:sz="4"/>
-              <w:bottom w:val="single" w:color="BFBFBF" w:sz="4"/>
-              <w:right w:val="single" w:color="BFBFBF" w:sz="4"/>
-            </w:tcBorders>
-            <w:tcMar>
-              <w:top w:type="dxa" w:w="60"/>
-              <w:left w:type="dxa" w:w="100"/>
-              <w:bottom w:type="dxa" w:w="60"/>
-              <w:right w:type="dxa" w:w="100"/>
-            </w:tcMar>
-          </w:tcPr>
-          <w:p>
-            <w:pPr>
-              <w:bidi/>
-              <w:spacing w:after="0"/>
-            </w:pPr>
-            <w:r>
-              <w:rPr>
-                <w:rFonts w:ascii="Arial" w:cs="Arial" w:eastAsia="Arial" w:hAnsi="Arial"/>
-                <w:sz w:val="19"/>
-                <w:szCs w:val="19"/>
-                <w:rtl/>
-              </w:rPr>
-              <w:t xml:space="preserve">זמן פנימי</w:t>
-            </w:r>
-          </w:p>
-        </w:tc>
-      </w:tr>
-      <w:tr>
-        <w:trPr>
-          <w:tblHeader w:val="false"/>
-        </w:trPr>
-        <w:tc>
-          <w:tcPr>
-            <w:tcW w:type="dxa" w:w="3506"/>
-            <w:tcBorders>
-              <w:top w:val="single" w:color="BFBFBF" w:sz="4"/>
-              <w:left w:val="single" w:color="BFBFBF" w:sz="4"/>
-              <w:bottom w:val="single" w:color="BFBFBF" w:sz="4"/>
-              <w:right w:val="single" w:color="BFBFBF" w:sz="4"/>
-            </w:tcBorders>
-            <w:tcMar>
-              <w:top w:type="dxa" w:w="60"/>
-              <w:left w:type="dxa" w:w="100"/>
-              <w:bottom w:type="dxa" w:w="60"/>
-              <w:right w:type="dxa" w:w="100"/>
-            </w:tcMar>
-          </w:tcPr>
-          <w:p>
-            <w:pPr>
-              <w:bidi/>
-              <w:spacing w:after="0"/>
-            </w:pPr>
-            <w:r>
-              <w:rPr>
-                <w:rFonts w:ascii="Arial" w:cs="Arial" w:eastAsia="Arial" w:hAnsi="Arial"/>
-                <w:sz w:val="19"/>
-                <w:szCs w:val="19"/>
-                <w:rtl/>
-              </w:rPr>
-              <w:t xml:space="preserve">תחזוקה אחרי העלייה</w:t>
-            </w:r>
-          </w:p>
-        </w:tc>
-        <w:tc>
-          <w:tcPr>
-            <w:tcW w:type="dxa" w:w="3504"/>
-            <w:tcBorders>
-              <w:top w:val="single" w:color="BFBFBF" w:sz="4"/>
-              <w:left w:val="single" w:color="BFBFBF" w:sz="4"/>
-              <w:bottom w:val="single" w:color="BFBFBF" w:sz="4"/>
-              <w:right w:val="single" w:color="BFBFBF" w:sz="4"/>
-            </w:tcBorders>
-            <w:tcMar>
-              <w:top w:type="dxa" w:w="60"/>
-              <w:left w:type="dxa" w:w="100"/>
-              <w:bottom w:type="dxa" w:w="60"/>
-              <w:right w:type="dxa" w:w="100"/>
-            </w:tcMar>
-          </w:tcPr>
-          <w:p>
-            <w:pPr>
-              <w:bidi/>
-              <w:spacing w:after="0"/>
-            </w:pPr>
-            <w:r>
-              <w:rPr>
-                <w:rFonts w:ascii="Arial" w:cs="Arial" w:eastAsia="Arial" w:hAnsi="Arial"/>
-                <w:sz w:val="19"/>
-                <w:szCs w:val="19"/>
-                <w:rtl/>
-              </w:rPr>
-              <w:t xml:space="preserve">כ-0.2 משרת מפתח וכ-0.1 משרת DBA</w:t>
+              <w:t xml:space="preserve">כ-2-3 ימי עבודה (הרשאות, משתמש Kiosk למסך הקיר, קבלת המערכת מהיועץ)</w:t>
             </w:r>
           </w:p>
         </w:tc>
@@ -6253,6 +6051,201 @@
       <w:pPr>
         <w:spacing w:after="120"/>
       </w:pPr>
+    </w:p>
+    <w:p>
+      <w:pPr>
+        <w:pStyle w:val="Heading2"/>
+        <w:bidi/>
+      </w:pPr>
+      <w:r>
+        <w:rPr>
+          <w:rFonts w:ascii="Arial" w:cs="Arial" w:eastAsia="Arial" w:hAnsi="Arial"/>
+          <w:rtl/>
+        </w:rPr>
+        <w:t xml:space="preserve">5.3 מה חייב להיות בהזמנת העבודה מול היועץ</w:t>
+      </w:r>
+    </w:p>
+    <w:p>
+      <w:pPr>
+        <w:bidi/>
+        <w:spacing w:after="120" w:line="276"/>
+        <w:jc w:val="start"/>
+      </w:pPr>
+      <w:r>
+        <w:rPr>
+          <w:rFonts w:ascii="Arial" w:cs="Arial" w:eastAsia="Arial" w:hAnsi="Arial"/>
+          <w:rtl/>
+        </w:rPr>
+        <w:t xml:space="preserve">כדי ש-IT יוכל לתחזק את המסך אחרי שהיועץ מסיים:</w:t>
+      </w:r>
+    </w:p>
+    <w:p>
+      <w:pPr>
+        <w:pStyle w:val="ListParagraph"/>
+        <w:numPr>
+          <w:ilvl w:val="0"/>
+          <w:numId w:val="3"/>
+        </w:numPr>
+        <w:bidi/>
+        <w:spacing w:after="60"/>
+        <w:jc w:val="start"/>
+      </w:pPr>
+      <w:r>
+        <w:rPr>
+          <w:rFonts w:ascii="Arial" w:cs="Arial" w:eastAsia="Arial" w:hAnsi="Arial"/>
+          <w:b/>
+          <w:bCs/>
+          <w:rtl/>
+        </w:rPr>
+        <w:t xml:space="preserve">בעלות:</w:t>
+      </w:r>
+      <w:r>
+        <w:rPr>
+          <w:rFonts w:ascii="Arial" w:cs="Arial" w:eastAsia="Arial" w:hAnsi="Arial"/>
+          <w:rtl/>
+        </w:rPr>
+        <w:t xml:space="preserve"> הניתוח, הסקריפטים וקוד ה-Mods נשמרים בספרייה של Spotfire וב-Git של הארגון, ולא אצל היועץ.</w:t>
+      </w:r>
+    </w:p>
+    <w:p>
+      <w:pPr>
+        <w:pStyle w:val="ListParagraph"/>
+        <w:numPr>
+          <w:ilvl w:val="0"/>
+          <w:numId w:val="3"/>
+        </w:numPr>
+        <w:bidi/>
+        <w:spacing w:after="60"/>
+        <w:jc w:val="start"/>
+      </w:pPr>
+      <w:r>
+        <w:rPr>
+          <w:rFonts w:ascii="Arial" w:cs="Arial" w:eastAsia="Arial" w:hAnsi="Arial"/>
+          <w:b/>
+          <w:bCs/>
+          <w:rtl/>
+        </w:rPr>
+        <w:t xml:space="preserve">לוגיקה ב-DW:</w:t>
+      </w:r>
+      <w:r>
+        <w:rPr>
+          <w:rFonts w:ascii="Arial" w:cs="Arial" w:eastAsia="Arial" w:hAnsi="Arial"/>
+          <w:rtl/>
+        </w:rPr>
+        <w:t xml:space="preserve"> כל הגדרות המדדים נמצאות ב-views ב-DW, ולא בחישובים בתוך Spotfire. כך שינוי הגדרה לא דורש לפתוח את הניתוח.</w:t>
+      </w:r>
+    </w:p>
+    <w:p>
+      <w:pPr>
+        <w:pStyle w:val="ListParagraph"/>
+        <w:numPr>
+          <w:ilvl w:val="0"/>
+          <w:numId w:val="3"/>
+        </w:numPr>
+        <w:bidi/>
+        <w:spacing w:after="60"/>
+        <w:jc w:val="start"/>
+      </w:pPr>
+      <w:r>
+        <w:rPr>
+          <w:rFonts w:ascii="Arial" w:cs="Arial" w:eastAsia="Arial" w:hAnsi="Arial"/>
+          <w:b/>
+          <w:bCs/>
+          <w:rtl/>
+        </w:rPr>
+        <w:t xml:space="preserve">שכבה נמוכה ככל האפשר:</w:t>
+      </w:r>
+      <w:r>
+        <w:rPr>
+          <w:rFonts w:ascii="Arial" w:cs="Arial" w:eastAsia="Arial" w:hAnsi="Arial"/>
+          <w:rtl/>
+        </w:rPr>
+        <w:t xml:space="preserve"> קודם כל מה ש-Spotfire נותן מהקופסה, אחר כך Mods, ורק בלית ברירה JavaScript. Spotfire Cloud מתעדכן אוטומטית, ו-JavaScript הוא הראשון להישבר בעדכון.</w:t>
+      </w:r>
+    </w:p>
+    <w:p>
+      <w:pPr>
+        <w:pStyle w:val="ListParagraph"/>
+        <w:numPr>
+          <w:ilvl w:val="0"/>
+          <w:numId w:val="3"/>
+        </w:numPr>
+        <w:bidi/>
+        <w:spacing w:after="60"/>
+        <w:jc w:val="start"/>
+      </w:pPr>
+      <w:r>
+        <w:rPr>
+          <w:rFonts w:ascii="Arial" w:cs="Arial" w:eastAsia="Arial" w:hAnsi="Arial"/>
+          <w:b/>
+          <w:bCs/>
+          <w:rtl/>
+        </w:rPr>
+        <w:t xml:space="preserve">תיעוד ורשימת בדיקות:</w:t>
+      </w:r>
+      <w:r>
+        <w:rPr>
+          <w:rFonts w:ascii="Arial" w:cs="Arial" w:eastAsia="Arial" w:hAnsi="Arial"/>
+          <w:rtl/>
+        </w:rPr>
+        <w:t xml:space="preserve"> מסמך תחזוקה, ורשימת בדיקות להרצה אחרי כל עדכון של Spotfire Cloud (מספרים מול Salesforce, רענון אוטומטי, קישורים, מסך הקיר).</w:t>
+      </w:r>
+    </w:p>
+    <w:p>
+      <w:pPr>
+        <w:pStyle w:val="ListParagraph"/>
+        <w:numPr>
+          <w:ilvl w:val="0"/>
+          <w:numId w:val="3"/>
+        </w:numPr>
+        <w:bidi/>
+        <w:spacing w:after="60"/>
+        <w:jc w:val="start"/>
+      </w:pPr>
+      <w:r>
+        <w:rPr>
+          <w:rFonts w:ascii="Arial" w:cs="Arial" w:eastAsia="Arial" w:hAnsi="Arial"/>
+          <w:b/>
+          <w:bCs/>
+          <w:rtl/>
+        </w:rPr>
+        <w:t xml:space="preserve">העברה:</w:t>
+      </w:r>
+      <w:r>
+        <w:rPr>
+          <w:rFonts w:ascii="Arial" w:cs="Arial" w:eastAsia="Arial" w:hAnsi="Arial"/>
+          <w:rtl/>
+        </w:rPr>
+        <w:t xml:space="preserve"> מפגש העברה מוקלט ל-IT, ובנק שעות לתיקונים בתקופת הניסוי.</w:t>
+      </w:r>
+    </w:p>
+    <w:p>
+      <w:pPr>
+        <w:pStyle w:val="ListParagraph"/>
+        <w:numPr>
+          <w:ilvl w:val="0"/>
+          <w:numId w:val="3"/>
+        </w:numPr>
+        <w:bidi/>
+        <w:spacing w:after="60"/>
+        <w:jc w:val="start"/>
+      </w:pPr>
+      <w:r>
+        <w:rPr>
+          <w:rFonts w:ascii="Arial" w:cs="Arial" w:eastAsia="Arial" w:hAnsi="Arial"/>
+          <w:b/>
+          <w:bCs/>
+          <w:rtl/>
+        </w:rPr>
+        <w:t xml:space="preserve">גישה לנתונים:</w:t>
+      </w:r>
+      <w:r>
+        <w:rPr>
+          <w:rFonts w:ascii="Arial" w:cs="Arial" w:eastAsia="Arial" w:hAnsi="Arial"/>
+          <w:rtl/>
+        </w:rPr>
+        <w:t xml:space="preserve"> הסכם שמכסה גישה לנתונים (BAA/NDA), או עבודה על סביבה עם נתונים מוסווים.</w:t>
+      </w:r>
     </w:p>
     <w:p>
       <w:pPr>
@@ -6599,6 +6592,12 @@
   </w:num>
   <w:num w:numId="2">
     <w:abstractNumId w:val="3"/>
+    <w:lvlOverride w:ilvl="0">
+      <w:startOverride w:val="1"/>
+    </w:lvlOverride>
+  </w:num>
+  <w:num w:numId="3">
+    <w:abstractNumId w:val="2"/>
     <w:lvlOverride w:ilvl="0">
       <w:startOverride w:val="1"/>
     </w:lvlOverride>

</xml_diff>

<commit_message>
Align all documents to the live refresh; rebuild mobile MVP on Spotfire
- Full MVP v1.1: DW is real time, the live screen refreshes every 30-60
  seconds on in-database tables, analytics keep scheduled refresh; no
  incremental load or backfill; field history comes from the existing
  Audit trail table; consultant selected
- Short MVP v2.3: consultant selected; history section now points to the
  Audit trail table and what to verify in it
- Mobile MVP v3.0: three Spotfire mobile pages of the live screen (Live,
  SLA at risk, waiting for pickup) built by the consultant within the
  MVP timeline, same data and refresh; dedicated app dropped
- Phone mockup reworked to the three Spotfire pages

Co-Authored-By: Claude Opus 5.5 <noreply@anthropic.com>
Claude-Session: https://claude.ai/code/session_01YcEMp91cmPuH2YbvGBFx73
</commit_message>
<xml_diff>
--- a/docs/MVP-Short.docx
+++ b/docs/MVP-Short.docx
@@ -100,7 +100,7 @@
                 <w:szCs w:val="19"/>
                 <w:rtl/>
               </w:rPr>
-              <w:t xml:space="preserve">2.2 (היקף מצומצם; יועץ חיצוני, ו-IT מתחזק)</w:t>
+              <w:t xml:space="preserve">2.3 (היקף מצומצם; יועץ חיצוני נבחר, ו-IT מתחזק)</w:t>
             </w:r>
           </w:p>
         </w:tc>
@@ -172,7 +172,7 @@
                 <w:szCs w:val="19"/>
                 <w:rtl/>
               </w:rPr>
-              <w:t xml:space="preserve">2026-10-19</w:t>
+              <w:t xml:space="preserve">2026-10-20</w:t>
             </w:r>
           </w:p>
         </w:tc>
@@ -3796,22 +3796,11 @@
             <w:r>
               <w:rPr>
                 <w:rFonts w:ascii="Arial" w:cs="Arial" w:eastAsia="Arial" w:hAnsi="Arial"/>
-                <w:b/>
-                <w:bCs/>
-                <w:sz w:val="19"/>
-                <w:szCs w:val="19"/>
-                <w:rtl/>
-              </w:rPr>
-              <w:t xml:space="preserve">אבל את שמירת ההיסטוריה צריך להתחיל עכשיו</w:t>
-            </w:r>
-            <w:r>
-              <w:rPr>
-                <w:rFonts w:ascii="Arial" w:cs="Arial" w:eastAsia="Arial" w:hAnsi="Arial"/>
-                <w:sz w:val="19"/>
-                <w:szCs w:val="19"/>
-                <w:rtl/>
-              </w:rPr>
-              <w:t xml:space="preserve"> (סעיף 6)</w:t>
+                <w:sz w:val="19"/>
+                <w:szCs w:val="19"/>
+                <w:rtl/>
+              </w:rPr>
+              <w:t xml:space="preserve">ההיסטוריה כבר נשמרת בטבלת Audit trail (סעיף 6)</w:t>
             </w:r>
           </w:p>
         </w:tc>
@@ -4636,7 +4625,7 @@
           <w:bCs/>
           <w:rtl/>
         </w:rPr>
-        <w:t xml:space="preserve">יועץ Spotfire חיצוני.</w:t>
+        <w:t xml:space="preserve">יועץ Spotfire חיצוני (נבחר).</w:t>
       </w:r>
       <w:r>
         <w:rPr>
@@ -4841,7 +4830,7 @@
                 <w:szCs w:val="19"/>
                 <w:rtl/>
               </w:rPr>
-              <w:t xml:space="preserve">הזמנת עבודה ליועץ, כולל דרישות ההעברה (5.3) והסכם גישה לנתונים</w:t>
+              <w:t xml:space="preserve">חתימה על הזמנת העבודה עם היועץ שנבחר, כולל דרישות ההעברה (5.3) והסכם גישה לנתונים</w:t>
             </w:r>
           </w:p>
         </w:tc>
@@ -6289,7 +6278,7 @@
           <w:rFonts w:ascii="Arial" w:cs="Arial" w:eastAsia="Arial" w:hAnsi="Arial"/>
           <w:rtl/>
         </w:rPr>
-        <w:t xml:space="preserve">6. משימה אחת שחייבת לקרות עכשיו, גם אם היא לא חלק מה-MVP</w:t>
+        <w:t xml:space="preserve">6. היסטוריה לגלים הבאים</w:t>
       </w:r>
     </w:p>
     <w:p>
@@ -6301,18 +6290,44 @@
       <w:r>
         <w:rPr>
           <w:rFonts w:ascii="Arial" w:cs="Arial" w:eastAsia="Arial" w:hAnsi="Arial"/>
+          <w:rtl/>
+        </w:rPr>
+        <w:t xml:space="preserve">ה-MVP הזה לא צריך היסטוריה, אבל הגלים הבאים (טרנדים, זמן בכל טיר, איכות לפי גרסה) תלויים בה. </w:t>
+      </w:r>
+      <w:r>
+        <w:rPr>
+          <w:rFonts w:ascii="Arial" w:cs="Arial" w:eastAsia="Arial" w:hAnsi="Arial"/>
           <w:b/>
           <w:bCs/>
           <w:rtl/>
         </w:rPr>
-        <w:t xml:space="preserve">שמירת היסטוריית השדות של Salesforce.</w:t>
-      </w:r>
-      <w:r>
-        <w:rPr>
-          <w:rFonts w:ascii="Arial" w:cs="Arial" w:eastAsia="Arial" w:hAnsi="Arial"/>
-          <w:rtl/>
-        </w:rPr>
-        <w:t xml:space="preserve"> אם אין ל-org את Field Audit Trail, Salesforce שומרת היסטוריית שדות בערך 18 חודשים (ועד 24 דרך ה-API). ה-MVP הזה לא צריך היסטוריה, אבל כל דבר בגל השני (טרנדים, זמן בכל טיר, איכות לפי גרסה) תלוי בה. כל חודש של המתנה מוחק חודש של נתונים לצמיתות. זו משימה של יום-יומיים ל-Salesforce Admin ול-DBA: לייצא את </w:t>
+        <w:t xml:space="preserve">היסטוריית השדות כבר נשמרת ב-DB, בטבלת Audit trail.</w:t>
+      </w:r>
+      <w:r>
+        <w:rPr>
+          <w:rFonts w:ascii="Arial" w:cs="Arial" w:eastAsia="Arial" w:hAnsi="Arial"/>
+          <w:rtl/>
+        </w:rPr>
+        <w:t xml:space="preserve"> לפני שמתחילים את הגל השני, צריך לבדוק מה היא מכסה:</w:t>
+      </w:r>
+    </w:p>
+    <w:p>
+      <w:pPr>
+        <w:pStyle w:val="ListParagraph"/>
+        <w:numPr>
+          <w:ilvl w:val="0"/>
+          <w:numId w:val="3"/>
+        </w:numPr>
+        <w:bidi/>
+        <w:spacing w:after="60"/>
+        <w:jc w:val="start"/>
+      </w:pPr>
+      <w:r>
+        <w:rPr>
+          <w:rFonts w:ascii="Arial" w:cs="Arial" w:eastAsia="Arial" w:hAnsi="Arial"/>
+          <w:rtl/>
+        </w:rPr>
+        <w:t xml:space="preserve">גם את </w:t>
       </w:r>
       <w:r>
         <w:rPr>
@@ -6321,14 +6336,14 @@
           <w:sz w:val="18"/>
           <w:szCs w:val="18"/>
         </w:rPr>
-        <w:t xml:space="preserve">CaseHistory</w:t>
-      </w:r>
-      <w:r>
-        <w:rPr>
-          <w:rFonts w:ascii="Arial" w:cs="Arial" w:eastAsia="Arial" w:hAnsi="Arial"/>
-          <w:rtl/>
-        </w:rPr>
-        <w:t xml:space="preserve"> ואת ההיסטוריה של </w:t>
+        <w:t xml:space="preserve">Request</w:t>
+      </w:r>
+      <w:r>
+        <w:rPr>
+          <w:rFonts w:ascii="Arial" w:cs="Arial" w:eastAsia="Arial" w:hAnsi="Arial"/>
+          <w:rtl/>
+        </w:rPr>
+        <w:t xml:space="preserve">, ולא רק את </w:t>
       </w:r>
       <w:r>
         <w:rPr>
@@ -6337,14 +6352,52 @@
           <w:sz w:val="18"/>
           <w:szCs w:val="18"/>
         </w:rPr>
-        <w:t xml:space="preserve">Request</w:t>
-      </w:r>
-      <w:r>
-        <w:rPr>
-          <w:rFonts w:ascii="Arial" w:cs="Arial" w:eastAsia="Arial" w:hAnsi="Arial"/>
-          <w:rtl/>
-        </w:rPr>
-        <w:t xml:space="preserve">, ולשמור אותן ב-DW.</w:t>
+        <w:t xml:space="preserve">Case</w:t>
+      </w:r>
+      <w:r>
+        <w:rPr>
+          <w:rFonts w:ascii="Arial" w:cs="Arial" w:eastAsia="Arial" w:hAnsi="Arial"/>
+          <w:rtl/>
+        </w:rPr>
+        <w:t xml:space="preserve">.</w:t>
+      </w:r>
+    </w:p>
+    <w:p>
+      <w:pPr>
+        <w:pStyle w:val="ListParagraph"/>
+        <w:numPr>
+          <w:ilvl w:val="0"/>
+          <w:numId w:val="3"/>
+        </w:numPr>
+        <w:bidi/>
+        <w:spacing w:after="60"/>
+        <w:jc w:val="start"/>
+      </w:pPr>
+      <w:r>
+        <w:rPr>
+          <w:rFonts w:ascii="Arial" w:cs="Arial" w:eastAsia="Arial" w:hAnsi="Arial"/>
+          <w:rtl/>
+        </w:rPr>
+        <w:t xml:space="preserve">את כל השדות שהמדדים צריכים: Status, Owner, Priority, דגל QARA ודגל הבאג.</w:t>
+      </w:r>
+    </w:p>
+    <w:p>
+      <w:pPr>
+        <w:pStyle w:val="ListParagraph"/>
+        <w:numPr>
+          <w:ilvl w:val="0"/>
+          <w:numId w:val="3"/>
+        </w:numPr>
+        <w:bidi/>
+        <w:spacing w:after="60"/>
+        <w:jc w:val="start"/>
+      </w:pPr>
+      <w:r>
+        <w:rPr>
+          <w:rFonts w:ascii="Arial" w:cs="Arial" w:eastAsia="Arial" w:hAnsi="Arial"/>
+          <w:rtl/>
+        </w:rPr>
+        <w:t xml:space="preserve">לכמה זמן אחורה (המדדים האנליטיים מתוכננים על 24 חודשים).</w:t>
       </w:r>
     </w:p>
     <w:sectPr>

</xml_diff>

<commit_message>
Short MVP 2.4: work order signed; point GitHub links at main
- Short MVP 2.4: the "before" step in the timeline is marked done (work
  order signed 2026-10-25 with the IT handover requirements, consultant
  has data access). Section 5.3 says it was signed and keeps the list as
  the acceptance checklist. This matches what PR #9 recorded in the full
  MVP and the decisions note.
- Full MVP and mobile MVP now reference short MVP 2.4. Word and PDF
  rebuilt for all three; page counts unchanged.
- Obsidian links pointed at claude/support-tracking-system-mvp-e26kbf,
  which GitHub deletes after each merge (404). The hub note and the
  source URL that tools/obsidian_sync.py writes into the document notes
  now point at main.

Co-Authored-By: Claude Opus 5.5 <noreply@anthropic.com>
Claude-Session: https://claude.ai/code/session_01YcEMp91cmPuH2YbvGBFx73
</commit_message>
<xml_diff>
--- a/docs/MVP-Short.docx
+++ b/docs/MVP-Short.docx
@@ -100,7 +100,7 @@
                 <w:szCs w:val="19"/>
                 <w:rtl/>
               </w:rPr>
-              <w:t xml:space="preserve">2.3 (היקף מצומצם; יועץ חיצוני נבחר, ו-IT מתחזק)</w:t>
+              <w:t xml:space="preserve">2.4 (היקף מצומצם; ההסכם עם היועץ נחתם, ו-IT מתחזק)</w:t>
             </w:r>
           </w:p>
         </w:tc>
@@ -172,7 +172,7 @@
                 <w:szCs w:val="19"/>
                 <w:rtl/>
               </w:rPr>
-              <w:t xml:space="preserve">2026-10-20</w:t>
+              <w:t xml:space="preserve">2026-10-25</w:t>
             </w:r>
           </w:p>
         </w:tc>
@@ -4826,11 +4826,22 @@
             <w:r>
               <w:rPr>
                 <w:rFonts w:ascii="Arial" w:cs="Arial" w:eastAsia="Arial" w:hAnsi="Arial"/>
-                <w:sz w:val="19"/>
-                <w:szCs w:val="19"/>
-                <w:rtl/>
-              </w:rPr>
-              <w:t xml:space="preserve">חתימה על הזמנת העבודה עם היועץ שנבחר, כולל דרישות ההעברה (5.3) והסכם גישה לנתונים</w:t>
+                <w:b/>
+                <w:bCs/>
+                <w:sz w:val="19"/>
+                <w:szCs w:val="19"/>
+                <w:rtl/>
+              </w:rPr>
+              <w:t xml:space="preserve">הושלם (2026-10-25):</w:t>
+            </w:r>
+            <w:r>
+              <w:rPr>
+                <w:rFonts w:ascii="Arial" w:cs="Arial" w:eastAsia="Arial" w:hAnsi="Arial"/>
+                <w:sz w:val="19"/>
+                <w:szCs w:val="19"/>
+                <w:rtl/>
+              </w:rPr>
+              <w:t xml:space="preserve"> הזמנת העבודה עם היועץ נחתמה, כולל דרישות ההעברה (5.3), ויש ליועץ גישה לנתונים</w:t>
             </w:r>
           </w:p>
         </w:tc>
@@ -6052,6 +6063,20 @@
           <w:rtl/>
         </w:rPr>
         <w:t xml:space="preserve">5.3 מה חייב להיות בהזמנת העבודה מול היועץ</w:t>
+      </w:r>
+    </w:p>
+    <w:p>
+      <w:pPr>
+        <w:bidi/>
+        <w:spacing w:after="120" w:line="276"/>
+        <w:jc w:val="start"/>
+      </w:pPr>
+      <w:r>
+        <w:rPr>
+          <w:rFonts w:ascii="Arial" w:cs="Arial" w:eastAsia="Arial" w:hAnsi="Arial"/>
+          <w:rtl/>
+        </w:rPr>
+        <w:t xml:space="preserve">הזמנת העבודה נחתמה ב-2026-10-25, כולל דרישות ההעברה ל-IT. הרשימה נשארת כאן כבסיס לבדיקה בקבלת המערכת מהיועץ.</w:t>
       </w:r>
     </w:p>
     <w:p>

</xml_diff>